<commit_message>
Add <li> tags to tutorial lists and update supporting files
Co-Authored-By: Claude Sonnet 4.6 <noreply@anthropic.com>
</commit_message>
<xml_diff>
--- a/docs/Michael_Wasserstein_CV.docx
+++ b/docs/Michael_Wasserstein_CV.docx
@@ -5,6 +5,7 @@
     <w:p>
       <w:pPr>
         <w:pStyle w:val="Title"/>
+        <w:spacing w:before="0"/>
         <w:ind w:right="4740"/>
       </w:pPr>
       <w:r>
@@ -34,7 +35,6 @@
         <w:tabs>
           <w:tab w:val="left" w:pos="8341"/>
         </w:tabs>
-        <w:spacing w:before="119"/>
         <w:ind w:left="220"/>
         <w:rPr>
           <w:sz w:val="20"/>
@@ -52,7 +52,7 @@
         </w:rPr>
         <w:tab/>
       </w:r>
-      <w:hyperlink r:id="rId5" w:history="1">
+      <w:hyperlink r:id="rId7" w:history="1">
         <w:r>
           <w:rPr>
             <w:rStyle w:val="Hyperlink"/>
@@ -70,7 +70,6 @@
         <w:tabs>
           <w:tab w:val="left" w:pos="8341"/>
         </w:tabs>
-        <w:spacing w:before="1"/>
         <w:ind w:left="220"/>
         <w:rPr>
           <w:spacing w:val="-4"/>
@@ -259,7 +258,7 @@
               </wp:anchor>
             </w:drawing>
           </mc:Choice>
-          <mc:Fallback>
+          <mc:Fallback xmlns:w16sdtfl="http://schemas.microsoft.com/office/word/2024/wordml/sdtformatlock">
             <w:pict>
               <v:shape w14:anchorId="19E7A287" id="docshape1" o:spid="_x0000_s1026" style="position:absolute;margin-left:36pt;margin-top:14.7pt;width:530.5pt;height:4.5pt;z-index:-251658752;visibility:visible;mso-wrap-style:square;mso-width-percent:0;mso-height-percent:0;mso-wrap-distance-left:0;mso-wrap-distance-top:0;mso-wrap-distance-right:0;mso-wrap-distance-bottom:0;mso-position-horizontal:absolute;mso-position-horizontal-relative:page;mso-position-vertical:absolute;mso-position-vertical-relative:text;mso-width-percent:0;mso-height-percent:0;mso-width-relative:page;mso-height-relative:page;v-text-anchor:top" coordsize="10610,90" o:gfxdata="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" path="m10610,72l,72,,90r10610,l10610,72xm10610,l,,,54r10610,l10610,xe" fillcolor="black" stroked="f">
                 <v:path arrowok="t" o:connecttype="custom" o:connectlocs="6737350,232410;0,232410;0,243840;6737350,243840;6737350,232410;6737350,186690;0,186690;0,220980;6737350,220980;6737350,186690" o:connectangles="0,0,0,0,0,0,0,0,0,0"/>
@@ -397,16 +396,11 @@
     <w:p>
       <w:pPr>
         <w:pStyle w:val="BodyText"/>
-        <w:spacing w:before="6"/>
-        <w:rPr>
-          <w:sz w:val="30"/>
-        </w:rPr>
       </w:pPr>
     </w:p>
     <w:p>
       <w:pPr>
         <w:pStyle w:val="Heading1"/>
-        <w:spacing w:before="1"/>
         <w:ind w:left="220"/>
         <w:rPr>
           <w:spacing w:val="-2"/>
@@ -424,7 +418,6 @@
     <w:p>
       <w:pPr>
         <w:pStyle w:val="Heading1"/>
-        <w:spacing w:before="1"/>
         <w:ind w:left="220"/>
         <w:rPr>
           <w:spacing w:val="-2"/>
@@ -436,7 +429,6 @@
         <w:tabs>
           <w:tab w:val="left" w:pos="9687"/>
         </w:tabs>
-        <w:spacing w:before="181"/>
         <w:ind w:left="220"/>
       </w:pPr>
       <w:r>
@@ -516,7 +508,6 @@
     <w:p>
       <w:pPr>
         <w:pStyle w:val="Heading1"/>
-        <w:spacing w:before="1"/>
         <w:ind w:left="220"/>
         <w:rPr>
           <w:b w:val="0"/>
@@ -582,7 +573,6 @@
         <w:tabs>
           <w:tab w:val="left" w:pos="9687"/>
         </w:tabs>
-        <w:spacing w:before="181"/>
         <w:ind w:left="220"/>
       </w:pPr>
       <w:r>
@@ -665,7 +655,6 @@
         <w:tabs>
           <w:tab w:val="left" w:pos="9841"/>
         </w:tabs>
-        <w:spacing w:before="1"/>
         <w:ind w:left="220"/>
         <w:rPr>
           <w:spacing w:val="-4"/>
@@ -708,7 +697,6 @@
         <w:tabs>
           <w:tab w:val="left" w:pos="9841"/>
         </w:tabs>
-        <w:spacing w:before="1"/>
         <w:ind w:left="220"/>
       </w:pPr>
       <w:r>
@@ -727,7 +715,6 @@
         <w:tabs>
           <w:tab w:val="left" w:pos="9910"/>
         </w:tabs>
-        <w:spacing w:before="179" w:line="252" w:lineRule="exact"/>
         <w:ind w:left="219"/>
         <w:rPr>
           <w:b w:val="0"/>
@@ -828,7 +815,6 @@
         <w:tabs>
           <w:tab w:val="left" w:pos="9833"/>
         </w:tabs>
-        <w:spacing w:line="252" w:lineRule="exact"/>
         <w:ind w:left="219"/>
       </w:pPr>
       <w:r>
@@ -850,15 +836,11 @@
     <w:p>
       <w:pPr>
         <w:pStyle w:val="BodyText"/>
-        <w:rPr>
-          <w:sz w:val="24"/>
-        </w:rPr>
       </w:pPr>
     </w:p>
     <w:p>
       <w:pPr>
         <w:pStyle w:val="Heading1"/>
-        <w:spacing w:before="148"/>
         <w:ind w:left="220"/>
         <w:rPr>
           <w:spacing w:val="-2"/>
@@ -892,7 +874,6 @@
           <w:ilvl w:val="0"/>
           <w:numId w:val="3"/>
         </w:numPr>
-        <w:spacing w:before="148"/>
         <w:rPr>
           <w:u w:val="none"/>
         </w:rPr>
@@ -913,7 +894,6 @@
           <w:ilvl w:val="0"/>
           <w:numId w:val="3"/>
         </w:numPr>
-        <w:spacing w:before="148"/>
         <w:rPr>
           <w:u w:val="none"/>
         </w:rPr>
@@ -934,7 +914,6 @@
           <w:ilvl w:val="0"/>
           <w:numId w:val="3"/>
         </w:numPr>
-        <w:spacing w:before="148"/>
         <w:rPr>
           <w:u w:val="none"/>
         </w:rPr>
@@ -955,31 +934,11 @@
           <w:ilvl w:val="0"/>
           <w:numId w:val="3"/>
         </w:numPr>
-        <w:spacing w:before="148"/>
-        <w:rPr>
-          <w:u w:val="none"/>
-        </w:rPr>
-      </w:pPr>
-      <w:r>
         <w:rPr>
           <w:b w:val="0"/>
           <w:bCs w:val="0"/>
           <w:u w:val="none"/>
         </w:rPr>
-        <w:t>Numerical weather prediction</w:t>
-      </w:r>
-    </w:p>
-    <w:p>
-      <w:pPr>
-        <w:pStyle w:val="Heading1"/>
-        <w:numPr>
-          <w:ilvl w:val="0"/>
-          <w:numId w:val="3"/>
-        </w:numPr>
-        <w:spacing w:before="148"/>
-        <w:rPr>
-          <w:u w:val="none"/>
-        </w:rPr>
       </w:pPr>
       <w:r>
         <w:rPr>
@@ -987,13 +946,13 @@
           <w:bCs w:val="0"/>
           <w:u w:val="none"/>
         </w:rPr>
-        <w:t>Machine Learning</w:t>
-      </w:r>
-    </w:p>
+        <w:t>Numerical weather prediction</w:t>
+      </w:r>
+    </w:p>
+    <w:p/>
     <w:p>
       <w:pPr>
         <w:pStyle w:val="Heading1"/>
-        <w:spacing w:before="211"/>
         <w:ind w:left="221"/>
         <w:rPr>
           <w:u w:val="none"/>
@@ -1006,10 +965,8 @@
     <w:p>
       <w:pPr>
         <w:pStyle w:val="BodyText"/>
-        <w:spacing w:before="9"/>
-        <w:rPr>
-          <w:b/>
-          <w:sz w:val="13"/>
+        <w:rPr>
+          <w:b/>
         </w:rPr>
       </w:pPr>
     </w:p>
@@ -1018,7 +975,6 @@
         <w:tabs>
           <w:tab w:val="left" w:pos="1748"/>
         </w:tabs>
-        <w:spacing w:before="92"/>
         <w:ind w:left="220"/>
       </w:pPr>
       <w:r>
@@ -1106,7 +1062,6 @@
     <w:p>
       <w:pPr>
         <w:pStyle w:val="BodyText"/>
-        <w:spacing w:before="5"/>
       </w:pPr>
     </w:p>
     <w:p>
@@ -1126,7 +1081,7 @@
         <w:t xml:space="preserve"> </w:t>
       </w:r>
       <w:r>
-        <w:t>-</w:t>
+        <w:t>–</w:t>
       </w:r>
       <w:r>
         <w:rPr>
@@ -1237,9 +1192,6 @@
           <w:tab w:val="left" w:pos="1681"/>
         </w:tabs>
         <w:ind w:left="220"/>
-        <w:rPr>
-          <w:sz w:val="26"/>
-        </w:rPr>
       </w:pPr>
     </w:p>
     <w:p>
@@ -1276,10 +1228,8 @@
     <w:p>
       <w:pPr>
         <w:pStyle w:val="BodyText"/>
-        <w:spacing w:before="10"/>
-        <w:rPr>
-          <w:b/>
-          <w:sz w:val="13"/>
+        <w:rPr>
+          <w:b/>
         </w:rPr>
       </w:pPr>
     </w:p>
@@ -1475,10 +1425,6 @@
     <w:p>
       <w:pPr>
         <w:pStyle w:val="BodyText"/>
-        <w:spacing w:before="7"/>
-        <w:rPr>
-          <w:sz w:val="21"/>
-        </w:rPr>
       </w:pPr>
     </w:p>
     <w:p>
@@ -1518,10 +1464,8 @@
     <w:p>
       <w:pPr>
         <w:pStyle w:val="BodyText"/>
-        <w:spacing w:before="5"/>
-        <w:rPr>
-          <w:b/>
-          <w:sz w:val="23"/>
+        <w:rPr>
+          <w:b/>
         </w:rPr>
       </w:pPr>
     </w:p>
@@ -1538,22 +1482,13 @@
         </w:tabs>
       </w:pPr>
       <w:r>
-        <w:t>Outstanding Student Presentation Award, AMS 21</w:t>
-      </w:r>
-      <w:r>
-        <w:rPr>
-          <w:vertAlign w:val="superscript"/>
-        </w:rPr>
-        <w:t>st</w:t>
-      </w:r>
-      <w:r>
-        <w:t xml:space="preserve"> Conference on Mountain </w:t>
-      </w:r>
-      <w:r>
-        <w:t>Meteorology</w:t>
-      </w:r>
-      <w:r>
-        <w:t>, Summer 2024</w:t>
+        <w:t>Massey Family Award</w:t>
+      </w:r>
+      <w:r>
+        <w:t xml:space="preserve"> for Data Science</w:t>
+      </w:r>
+      <w:r>
+        <w:t>, University of Utah Department of Atmospheric Sciences, Spring 2026</w:t>
       </w:r>
     </w:p>
     <w:p>
@@ -1569,10 +1504,19 @@
         </w:tabs>
       </w:pPr>
       <w:r>
-        <w:t xml:space="preserve">NCAR Advanced Study Program (ASP) Graduate Visitor Program (GVP) </w:t>
-      </w:r>
-      <w:r>
-        <w:t>Fellowship</w:t>
+        <w:t>Outstanding Student Presentation Award, AMS 21</w:t>
+      </w:r>
+      <w:r>
+        <w:rPr>
+          <w:vertAlign w:val="superscript"/>
+        </w:rPr>
+        <w:t>st</w:t>
+      </w:r>
+      <w:r>
+        <w:t xml:space="preserve"> Conference on Mountain </w:t>
+      </w:r>
+      <w:r>
+        <w:t>Meteorology</w:t>
       </w:r>
       <w:r>
         <w:t>, Summer 2024</w:t>
@@ -1591,7 +1535,13 @@
         </w:tabs>
       </w:pPr>
       <w:r>
-        <w:t>NCAR Student Visit, August 2023</w:t>
+        <w:t xml:space="preserve">NCAR Advanced Study Program (ASP) Graduate Visitor Program (GVP) </w:t>
+      </w:r>
+      <w:r>
+        <w:t>Fellowship</w:t>
+      </w:r>
+      <w:r>
+        <w:t>, Summer 2024</w:t>
       </w:r>
     </w:p>
     <w:p>
@@ -1607,7 +1557,7 @@
         </w:tabs>
       </w:pPr>
       <w:r>
-        <w:t>College Scholar, Spring 2018, Fall 2018, Fall 2019, Spring 2019, Fall 2020, Spring 2020, Spring 2021</w:t>
+        <w:t>NCAR Student Visit, August 2023</w:t>
       </w:r>
     </w:p>
     <w:p>
@@ -1623,15 +1573,7 @@
         </w:tabs>
       </w:pPr>
       <w:r>
-        <w:t xml:space="preserve">NESCAC All-Academic Team, </w:t>
-      </w:r>
-      <w:proofErr w:type="gramStart"/>
-      <w:r>
-        <w:t>Fall</w:t>
-      </w:r>
-      <w:proofErr w:type="gramEnd"/>
-      <w:r>
-        <w:t xml:space="preserve"> 2019, Spring 2020, Fall 2020, Spring 2021</w:t>
+        <w:t>College Scholar, Spring 2018, Fall 2018, Fall 2019, Spring 2019, Fall 2020, Spring 2020, Spring 2021</w:t>
       </w:r>
     </w:p>
     <w:p>
@@ -1647,16 +1589,40 @@
         </w:tabs>
       </w:pPr>
       <w:r>
-        <w:t>Dean’s List, Fall 2017</w:t>
-      </w:r>
-    </w:p>
-    <w:p>
-      <w:pPr>
+        <w:t xml:space="preserve">NESCAC All-Academic Team, </w:t>
+      </w:r>
+      <w:proofErr w:type="gramStart"/>
+      <w:r>
+        <w:t>Fall</w:t>
+      </w:r>
+      <w:proofErr w:type="gramEnd"/>
+      <w:r>
+        <w:t xml:space="preserve"> 2019, Spring 2020, Fall 2020, Spring 2021</w:t>
+      </w:r>
+    </w:p>
+    <w:p>
+      <w:pPr>
+        <w:pStyle w:val="ListParagraph"/>
+        <w:numPr>
+          <w:ilvl w:val="0"/>
+          <w:numId w:val="6"/>
+        </w:numPr>
         <w:tabs>
           <w:tab w:val="left" w:pos="940"/>
           <w:tab w:val="left" w:pos="941"/>
         </w:tabs>
       </w:pPr>
+      <w:r>
+        <w:t>Dean’s List, Fall 2017</w:t>
+      </w:r>
+    </w:p>
+    <w:p>
+      <w:pPr>
+        <w:tabs>
+          <w:tab w:val="left" w:pos="940"/>
+          <w:tab w:val="left" w:pos="941"/>
+        </w:tabs>
+      </w:pPr>
     </w:p>
     <w:p>
       <w:pPr>
@@ -1670,6 +1636,48 @@
       <w:pPr>
         <w:pStyle w:val="Heading1"/>
       </w:pPr>
+    </w:p>
+    <w:p>
+      <w:pPr>
+        <w:pStyle w:val="BodyText"/>
+        <w:ind w:left="90"/>
+        <w:rPr>
+          <w:u w:color="000000"/>
+        </w:rPr>
+      </w:pPr>
+      <w:r>
+        <w:rPr>
+          <w:u w:color="000000"/>
+        </w:rPr>
+        <w:t>Diverse characteristics of extreme orographic snowfall events in Little Cottonwood Canyon</w:t>
+      </w:r>
+      <w:r>
+        <w:rPr>
+          <w:u w:color="000000"/>
+        </w:rPr>
+        <w:t>. Seminar, Utah Avalanche   Center, January 2026.</w:t>
+      </w:r>
+    </w:p>
+    <w:p>
+      <w:pPr>
+        <w:pStyle w:val="BodyText"/>
+        <w:ind w:firstLine="119"/>
+      </w:pPr>
+    </w:p>
+    <w:p>
+      <w:pPr>
+        <w:pStyle w:val="BodyText"/>
+        <w:ind w:firstLine="119"/>
+      </w:pPr>
+      <w:r>
+        <w:t>Fine-scale prediction of orographic precipitation in multi-ridge orography</w:t>
+      </w:r>
+      <w:r>
+        <w:t xml:space="preserve">. </w:t>
+      </w:r>
+      <w:r>
+        <w:t>Seminar, University of Utah, September 2024.</w:t>
+      </w:r>
     </w:p>
     <w:p>
       <w:pPr>
@@ -1683,22 +1691,6 @@
     </w:p>
     <w:p>
       <w:pPr>
-        <w:pStyle w:val="BodyText"/>
-        <w:spacing w:before="9"/>
-        <w:ind w:firstLine="119"/>
-      </w:pPr>
-      <w:r>
-        <w:t>Fine-scale prediction of orographic precipitation in multi-ridge orography</w:t>
-      </w:r>
-      <w:r>
-        <w:t xml:space="preserve">. </w:t>
-      </w:r>
-      <w:r>
-        <w:t>Seminar, University of Utah, September 2024.</w:t>
-      </w:r>
-    </w:p>
-    <w:p>
-      <w:pPr>
         <w:pStyle w:val="Heading1"/>
         <w:rPr>
           <w:b w:val="0"/>
@@ -1706,168 +1698,166 @@
           <w:u w:val="none"/>
         </w:rPr>
       </w:pPr>
-    </w:p>
-    <w:p>
-      <w:pPr>
-        <w:pStyle w:val="Heading1"/>
+      <w:r>
         <w:rPr>
           <w:b w:val="0"/>
           <w:bCs w:val="0"/>
           <w:u w:val="none"/>
         </w:rPr>
-      </w:pPr>
+        <w:t>Fine-scale prediction of orographic precipitation in multi-ridge orography</w:t>
+      </w:r>
       <w:r>
         <w:rPr>
           <w:b w:val="0"/>
           <w:bCs w:val="0"/>
           <w:u w:val="none"/>
         </w:rPr>
-        <w:t>Fine-scale prediction of orographic precipitation in multi-ridge orography</w:t>
-      </w:r>
+        <w:t xml:space="preserve">. Research Applications Lab </w:t>
+      </w:r>
+      <w:proofErr w:type="spellStart"/>
       <w:r>
         <w:rPr>
           <w:b w:val="0"/>
           <w:bCs w:val="0"/>
           <w:u w:val="none"/>
         </w:rPr>
-        <w:t xml:space="preserve">. Research Applications Lab </w:t>
-      </w:r>
-      <w:proofErr w:type="spellStart"/>
+        <w:t>HAPpy</w:t>
+      </w:r>
+      <w:proofErr w:type="spellEnd"/>
       <w:r>
         <w:rPr>
           <w:b w:val="0"/>
           <w:bCs w:val="0"/>
           <w:u w:val="none"/>
         </w:rPr>
-        <w:t>HAPpy</w:t>
-      </w:r>
-      <w:proofErr w:type="spellEnd"/>
-      <w:r>
+        <w:t xml:space="preserve"> Hour Seminar, NCAR, June 2024.</w:t>
+      </w:r>
+    </w:p>
+    <w:p>
+      <w:pPr>
+        <w:pStyle w:val="Heading1"/>
+      </w:pPr>
+    </w:p>
+    <w:p>
+      <w:pPr>
+        <w:pStyle w:val="Heading1"/>
         <w:rPr>
           <w:b w:val="0"/>
           <w:bCs w:val="0"/>
           <w:u w:val="none"/>
         </w:rPr>
-        <w:t xml:space="preserve"> Hour Seminar, NCAR, June 2024.</w:t>
-      </w:r>
-    </w:p>
-    <w:p>
-      <w:pPr>
-        <w:pStyle w:val="Heading1"/>
-      </w:pPr>
-    </w:p>
-    <w:p>
-      <w:pPr>
-        <w:pStyle w:val="Heading1"/>
+      </w:pPr>
+      <w:r>
         <w:rPr>
           <w:b w:val="0"/>
           <w:bCs w:val="0"/>
           <w:u w:val="none"/>
         </w:rPr>
-      </w:pPr>
+        <w:t>Cool-season orographic snowfall extremes in the central Wasatch Mountains, Utah, USA</w:t>
+      </w:r>
       <w:r>
         <w:rPr>
           <w:b w:val="0"/>
           <w:bCs w:val="0"/>
           <w:u w:val="none"/>
         </w:rPr>
-        <w:t>Cool-season orographic snowfall extremes in the central Wasatch Mountains, Utah, USA</w:t>
-      </w:r>
-      <w:r>
+        <w:t>. National Weather Service Salt Lake City Fall Seminar, NWS SLC, November 2023.</w:t>
+      </w:r>
+    </w:p>
+    <w:p>
+      <w:pPr>
+        <w:pStyle w:val="Heading1"/>
+      </w:pPr>
+    </w:p>
+    <w:p>
+      <w:pPr>
+        <w:pStyle w:val="Heading1"/>
         <w:rPr>
           <w:b w:val="0"/>
           <w:bCs w:val="0"/>
           <w:u w:val="none"/>
         </w:rPr>
-        <w:t>. National Weather Service Salt Lake City Fall Seminar, NWS SLC, November 2023.</w:t>
-      </w:r>
-    </w:p>
-    <w:p>
-      <w:pPr>
-        <w:pStyle w:val="Heading1"/>
-      </w:pPr>
-    </w:p>
-    <w:p>
-      <w:pPr>
-        <w:pStyle w:val="Heading1"/>
+      </w:pPr>
+      <w:r>
         <w:rPr>
           <w:b w:val="0"/>
           <w:bCs w:val="0"/>
           <w:u w:val="none"/>
         </w:rPr>
-      </w:pPr>
+        <w:t>Cool-season orographic snowfall extremes in the central Wasatch Mountains, Utah, USA</w:t>
+      </w:r>
       <w:r>
         <w:rPr>
           <w:b w:val="0"/>
           <w:bCs w:val="0"/>
           <w:u w:val="none"/>
         </w:rPr>
-        <w:t>Cool-season orographic snowfall extremes in the central Wasatch Mountains, Utah, USA</w:t>
-      </w:r>
-      <w:r>
+        <w:t>. Research Applications Lab Seminar, NCAR, August 2023.</w:t>
+      </w:r>
+    </w:p>
+    <w:p>
+      <w:pPr>
+        <w:pStyle w:val="Heading1"/>
+      </w:pPr>
+    </w:p>
+    <w:p>
+      <w:pPr>
+        <w:pStyle w:val="Heading1"/>
         <w:rPr>
           <w:b w:val="0"/>
           <w:bCs w:val="0"/>
           <w:u w:val="none"/>
         </w:rPr>
-        <w:t>. Research Applications Lab Seminar, NCAR, August 2023.</w:t>
-      </w:r>
-    </w:p>
-    <w:p>
-      <w:pPr>
-        <w:pStyle w:val="Heading1"/>
-      </w:pPr>
-    </w:p>
-    <w:p>
-      <w:pPr>
-        <w:pStyle w:val="Heading1"/>
+      </w:pPr>
+      <w:r>
         <w:rPr>
           <w:b w:val="0"/>
           <w:bCs w:val="0"/>
           <w:u w:val="none"/>
         </w:rPr>
-      </w:pPr>
+        <w:t>Avalanches, Cool-Season Orographic Precipitation Extremes, and Deep-Powder Skiing in Little Cottonwood Canyon, Utah</w:t>
+      </w:r>
       <w:r>
         <w:rPr>
           <w:b w:val="0"/>
           <w:bCs w:val="0"/>
           <w:u w:val="none"/>
         </w:rPr>
-        <w:t>Avalanches, Cool-Season Orographic Precipitation Extremes, and Deep-Powder Skiing in Little Cottonwood Canyon, Utah</w:t>
-      </w:r>
-      <w:r>
+        <w:t>. Seminar, University of Innsbruck, June 2023.</w:t>
+      </w:r>
+    </w:p>
+    <w:p>
+      <w:pPr>
+        <w:pStyle w:val="Heading1"/>
+        <w:rPr>
+          <w:u w:val="none"/>
+        </w:rPr>
+      </w:pPr>
+    </w:p>
+    <w:p>
+      <w:pPr>
+        <w:pStyle w:val="Heading1"/>
         <w:rPr>
           <w:b w:val="0"/>
           <w:bCs w:val="0"/>
           <w:u w:val="none"/>
         </w:rPr>
-        <w:t>. Seminar, University of Innsbruck, June 2023.</w:t>
-      </w:r>
-    </w:p>
-    <w:p>
-      <w:pPr>
-        <w:pStyle w:val="Heading1"/>
-        <w:rPr>
-          <w:u w:val="none"/>
-        </w:rPr>
-      </w:pPr>
-    </w:p>
-    <w:p>
-      <w:pPr>
-        <w:pStyle w:val="Heading1"/>
+      </w:pPr>
+      <w:r>
         <w:rPr>
           <w:b w:val="0"/>
           <w:bCs w:val="0"/>
           <w:u w:val="none"/>
         </w:rPr>
-      </w:pPr>
+        <w:t>Characteristics of Cool Season Orographic Precipitation Extremes in the Central Wasatch</w:t>
+      </w:r>
       <w:r>
         <w:rPr>
           <w:b w:val="0"/>
           <w:bCs w:val="0"/>
           <w:u w:val="none"/>
         </w:rPr>
-        <w:t>Characteristics of Cool Season Orographic Precipitation Extremes in the Central Wasatch</w:t>
+        <w:t>. ECSC 0350</w:t>
       </w:r>
       <w:r>
         <w:rPr>
@@ -1875,7 +1865,7 @@
           <w:bCs w:val="0"/>
           <w:u w:val="none"/>
         </w:rPr>
-        <w:t>. ECSC 0350</w:t>
+        <w:t xml:space="preserve">; </w:t>
       </w:r>
       <w:r>
         <w:rPr>
@@ -1883,7 +1873,7 @@
           <w:bCs w:val="0"/>
           <w:u w:val="none"/>
         </w:rPr>
-        <w:t xml:space="preserve">; </w:t>
+        <w:t>The Mountain Critical Zone</w:t>
       </w:r>
       <w:r>
         <w:rPr>
@@ -1891,7 +1881,7 @@
           <w:bCs w:val="0"/>
           <w:u w:val="none"/>
         </w:rPr>
-        <w:t>The Mountain Critical Zone</w:t>
+        <w:t>, Middlebury College</w:t>
       </w:r>
       <w:r>
         <w:rPr>
@@ -1899,7 +1889,7 @@
           <w:bCs w:val="0"/>
           <w:u w:val="none"/>
         </w:rPr>
-        <w:t>, Middlebury College</w:t>
+        <w:t xml:space="preserve"> (virtual)</w:t>
       </w:r>
       <w:r>
         <w:rPr>
@@ -1907,16 +1897,73 @@
           <w:bCs w:val="0"/>
           <w:u w:val="none"/>
         </w:rPr>
-        <w:t xml:space="preserve"> (virtual)</w:t>
-      </w:r>
-      <w:r>
+        <w:t>, February 2023.</w:t>
+      </w:r>
+    </w:p>
+    <w:p>
+      <w:pPr>
+        <w:pStyle w:val="Heading1"/>
         <w:rPr>
           <w:b w:val="0"/>
           <w:bCs w:val="0"/>
           <w:u w:val="none"/>
         </w:rPr>
-        <w:t>, February 2023.</w:t>
-      </w:r>
+      </w:pPr>
+    </w:p>
+    <w:p>
+      <w:pPr>
+        <w:pStyle w:val="BodyText"/>
+      </w:pPr>
+      <w:r>
+        <w:rPr>
+          <w:b/>
+          <w:bCs/>
+        </w:rPr>
+        <w:t xml:space="preserve">  </w:t>
+      </w:r>
+      <w:r>
+        <w:t>Characteristics of Precipitation Extremes in the Central Wasatch</w:t>
+      </w:r>
+      <w:r>
+        <w:t>. Seminar, University of Utah, November 2022</w:t>
+      </w:r>
+      <w:r>
+        <w:t>.</w:t>
+      </w:r>
+    </w:p>
+    <w:p>
+      <w:pPr>
+        <w:pStyle w:val="BodyText"/>
+      </w:pPr>
+    </w:p>
+    <w:p>
+      <w:pPr>
+        <w:pStyle w:val="BodyText"/>
+      </w:pPr>
+      <w:r>
+        <w:t xml:space="preserve">  Weather. </w:t>
+      </w:r>
+      <w:r>
+        <w:t>OEL-352: Avalanche Ecology, Westminster College, February 2022.</w:t>
+      </w:r>
+    </w:p>
+    <w:p>
+      <w:pPr>
+        <w:pStyle w:val="BodyText"/>
+      </w:pPr>
+    </w:p>
+    <w:p>
+      <w:pPr>
+        <w:pStyle w:val="Heading1"/>
+      </w:pPr>
+      <w:r>
+        <w:t>PUBLICATIONS</w:t>
+      </w:r>
+    </w:p>
+    <w:p>
+      <w:pPr>
+        <w:pStyle w:val="Heading1"/>
+      </w:pPr>
     </w:p>
     <w:p>
       <w:pPr>
@@ -1927,86 +1974,19 @@
           <w:u w:val="none"/>
         </w:rPr>
       </w:pPr>
-    </w:p>
-    <w:p>
-      <w:pPr>
-        <w:pStyle w:val="BodyText"/>
-        <w:spacing w:before="9"/>
-      </w:pPr>
-      <w:r>
-        <w:rPr>
-          <w:b/>
-          <w:bCs/>
-        </w:rPr>
-        <w:t xml:space="preserve">  </w:t>
-      </w:r>
-      <w:r>
-        <w:t>Characteristics of Precipitation Extremes in the Central Wasatch</w:t>
-      </w:r>
-      <w:r>
-        <w:t>. Seminar, University of Utah, November 2022</w:t>
-      </w:r>
-      <w:r>
-        <w:t>.</w:t>
-      </w:r>
-    </w:p>
-    <w:p>
-      <w:pPr>
-        <w:pStyle w:val="BodyText"/>
-        <w:spacing w:before="9"/>
-      </w:pPr>
-    </w:p>
-    <w:p>
-      <w:pPr>
-        <w:pStyle w:val="BodyText"/>
-        <w:spacing w:before="9"/>
-      </w:pPr>
-      <w:r>
-        <w:t xml:space="preserve">  Weather. </w:t>
-      </w:r>
-      <w:r>
-        <w:t>OEL-352: Avalanche Ecology, Westminster College, February 2022.</w:t>
-      </w:r>
-    </w:p>
-    <w:p>
-      <w:pPr>
-        <w:pStyle w:val="BodyText"/>
-        <w:spacing w:before="9"/>
-      </w:pPr>
-    </w:p>
-    <w:p>
-      <w:pPr>
-        <w:pStyle w:val="BodyText"/>
-        <w:spacing w:before="9"/>
-      </w:pPr>
-    </w:p>
-    <w:p>
-      <w:pPr>
-        <w:pStyle w:val="Heading1"/>
-      </w:pPr>
-      <w:r>
-        <w:t>PUBLICATIONS</w:t>
-      </w:r>
-    </w:p>
-    <w:p>
-      <w:pPr>
-        <w:pStyle w:val="Heading1"/>
-      </w:pPr>
-    </w:p>
-    <w:p>
-      <w:pPr>
-        <w:pStyle w:val="Heading1"/>
+      <w:r>
+        <w:rPr>
+          <w:u w:val="none"/>
+        </w:rPr>
+        <w:t>Wasserstein, M. L.</w:t>
+      </w:r>
+      <w:r>
         <w:rPr>
           <w:b w:val="0"/>
           <w:bCs w:val="0"/>
           <w:u w:val="none"/>
         </w:rPr>
-      </w:pPr>
-      <w:r>
-        <w:rPr>
-          <w:u w:val="none"/>
-        </w:rPr>
-        <w:t>Wasserstein, M. L.</w:t>
+        <w:t xml:space="preserve">, Evans, A. L., Veals, P. G., Kingsmill, D. E., and Steenburgh, W.J.: </w:t>
       </w:r>
       <w:r>
         <w:rPr>
@@ -2014,67 +1994,31 @@
           <w:bCs w:val="0"/>
           <w:u w:val="none"/>
         </w:rPr>
-        <w:t xml:space="preserve">, Evans, A. L., </w:t>
-      </w:r>
-      <w:proofErr w:type="spellStart"/>
+        <w:t>Orographic Influences on Precipitation in a Continental Mountain Environment as Observed by Mountain and Valley Profiling Radars</w:t>
+      </w:r>
       <w:r>
         <w:rPr>
           <w:b w:val="0"/>
           <w:bCs w:val="0"/>
           <w:u w:val="none"/>
         </w:rPr>
-        <w:t>Veals</w:t>
-      </w:r>
-      <w:proofErr w:type="spellEnd"/>
+        <w:t xml:space="preserve">. </w:t>
+      </w:r>
       <w:r>
         <w:rPr>
           <w:b w:val="0"/>
           <w:bCs w:val="0"/>
           <w:u w:val="none"/>
         </w:rPr>
-        <w:t xml:space="preserve">, P. G., Kingsmill, D. E., and </w:t>
-      </w:r>
-      <w:proofErr w:type="spellStart"/>
+        <w:t>Submitted</w:t>
+      </w:r>
       <w:r>
         <w:rPr>
           <w:b w:val="0"/>
           <w:bCs w:val="0"/>
           <w:u w:val="none"/>
         </w:rPr>
-        <w:t>Steenburgh</w:t>
-      </w:r>
-      <w:proofErr w:type="spellEnd"/>
-      <w:r>
-        <w:rPr>
-          <w:b w:val="0"/>
-          <w:bCs w:val="0"/>
-          <w:u w:val="none"/>
-        </w:rPr>
-        <w:t xml:space="preserve">, W.J.: </w:t>
-      </w:r>
-      <w:r>
-        <w:rPr>
-          <w:b w:val="0"/>
-          <w:bCs w:val="0"/>
-          <w:u w:val="none"/>
-        </w:rPr>
-        <w:t>Orographic Influences on Precipitation in a Continental Mountain Environment as Observed by Mountain and Valley Profiling Radars</w:t>
-      </w:r>
-      <w:r>
-        <w:rPr>
-          <w:b w:val="0"/>
-          <w:bCs w:val="0"/>
-          <w:u w:val="none"/>
-        </w:rPr>
-        <w:t xml:space="preserve">. </w:t>
-      </w:r>
-      <w:r>
-        <w:rPr>
-          <w:b w:val="0"/>
-          <w:bCs w:val="0"/>
-          <w:u w:val="none"/>
-        </w:rPr>
-        <w:t xml:space="preserve">In prep for submission to </w:t>
+        <w:t xml:space="preserve"> to </w:t>
       </w:r>
       <w:r>
         <w:rPr>
@@ -2112,24 +2056,10 @@
         <w:t>Wasserstein, M. L.</w:t>
       </w:r>
       <w:r>
-        <w:t xml:space="preserve"> and </w:t>
-      </w:r>
-      <w:proofErr w:type="spellStart"/>
-      <w:r>
-        <w:t>Steenburgh</w:t>
-      </w:r>
-      <w:proofErr w:type="spellEnd"/>
-      <w:r>
-        <w:t>,</w:t>
-      </w:r>
-      <w:r>
-        <w:t xml:space="preserve"> </w:t>
-      </w:r>
-      <w:r>
-        <w:t>W. J.</w:t>
-      </w:r>
-      <w:r>
-        <w:t>,</w:t>
+        <w:t xml:space="preserve"> and Steenburgh,</w:t>
+      </w:r>
+      <w:r>
+        <w:t xml:space="preserve"> W. J.,</w:t>
       </w:r>
       <w:r>
         <w:t xml:space="preserve"> 2024: Diverse Characteristics of Extreme Orographic Snowfall Events in Little Cottonwood Canyon, Utah. </w:t>
@@ -2154,7 +2084,7 @@
       <w:r>
         <w:t xml:space="preserve">, 945–966, </w:t>
       </w:r>
-      <w:hyperlink r:id="rId6" w:history="1">
+      <w:hyperlink r:id="rId8" w:history="1">
         <w:r>
           <w:rPr>
             <w:rStyle w:val="Hyperlink"/>
@@ -2169,10 +2099,6 @@
     <w:p>
       <w:pPr>
         <w:pStyle w:val="BodyText"/>
-        <w:spacing w:before="9"/>
-        <w:rPr>
-          <w:sz w:val="21"/>
-        </w:rPr>
       </w:pPr>
     </w:p>
     <w:p>
@@ -2210,9 +2136,184 @@
     </w:p>
     <w:p>
       <w:pPr>
+        <w:pStyle w:val="Heading1"/>
+        <w:rPr>
+          <w:spacing w:val="-2"/>
+          <w:u w:val="none"/>
+        </w:rPr>
+      </w:pPr>
+      <w:r>
+        <w:rPr>
+          <w:spacing w:val="-2"/>
+          <w:u w:val="none"/>
+        </w:rPr>
+        <w:t xml:space="preserve">Wasserstein, M.L., </w:t>
+      </w:r>
+      <w:r>
+        <w:rPr>
+          <w:b w:val="0"/>
+          <w:bCs w:val="0"/>
+          <w:spacing w:val="-2"/>
+          <w:u w:val="none"/>
+        </w:rPr>
+        <w:t xml:space="preserve">Evans, A.N., </w:t>
+      </w:r>
+      <w:proofErr w:type="spellStart"/>
+      <w:r>
+        <w:rPr>
+          <w:b w:val="0"/>
+          <w:bCs w:val="0"/>
+          <w:spacing w:val="-2"/>
+          <w:u w:val="none"/>
+        </w:rPr>
+        <w:t>Veals</w:t>
+      </w:r>
+      <w:proofErr w:type="spellEnd"/>
+      <w:r>
+        <w:rPr>
+          <w:b w:val="0"/>
+          <w:bCs w:val="0"/>
+          <w:spacing w:val="-2"/>
+          <w:u w:val="none"/>
+        </w:rPr>
+        <w:t>, P., Kingsmill, D.E., and Steenburgh, J., 202</w:t>
+      </w:r>
+      <w:r>
+        <w:rPr>
+          <w:b w:val="0"/>
+          <w:bCs w:val="0"/>
+          <w:spacing w:val="-2"/>
+          <w:u w:val="none"/>
+        </w:rPr>
+        <w:t>6</w:t>
+      </w:r>
+      <w:r>
+        <w:rPr>
+          <w:b w:val="0"/>
+          <w:bCs w:val="0"/>
+          <w:spacing w:val="-2"/>
+          <w:u w:val="none"/>
+        </w:rPr>
+        <w:t>:</w:t>
+      </w:r>
+      <w:r>
+        <w:rPr>
+          <w:b w:val="0"/>
+          <w:bCs w:val="0"/>
+          <w:u w:val="none"/>
+        </w:rPr>
+        <w:t xml:space="preserve"> </w:t>
+      </w:r>
+      <w:r>
+        <w:rPr>
+          <w:b w:val="0"/>
+          <w:bCs w:val="0"/>
+          <w:spacing w:val="-2"/>
+          <w:u w:val="none"/>
+        </w:rPr>
+        <w:t>Orographic Influences on Precipitation in the Wasatch Mountains as Observed by Mountain and Valley Profiling Radars, 22</w:t>
+      </w:r>
+      <w:r>
+        <w:rPr>
+          <w:b w:val="0"/>
+          <w:bCs w:val="0"/>
+          <w:spacing w:val="-2"/>
+          <w:u w:val="none"/>
+          <w:vertAlign w:val="superscript"/>
+        </w:rPr>
+        <w:t>nd</w:t>
+      </w:r>
+      <w:r>
+        <w:rPr>
+          <w:b w:val="0"/>
+          <w:bCs w:val="0"/>
+          <w:spacing w:val="-2"/>
+          <w:u w:val="none"/>
+        </w:rPr>
+        <w:t xml:space="preserve"> Conference on Mountain Meteorology, AMS, Madison, WI.</w:t>
+      </w:r>
+    </w:p>
+    <w:p>
+      <w:pPr>
+        <w:pStyle w:val="Heading1"/>
+        <w:rPr>
+          <w:spacing w:val="-2"/>
+        </w:rPr>
+      </w:pPr>
+    </w:p>
+    <w:p>
+      <w:pPr>
         <w:ind w:left="118"/>
       </w:pPr>
       <w:r>
+        <w:rPr>
+          <w:b/>
+          <w:bCs/>
+        </w:rPr>
+        <w:t>Wasserstein, M.L.</w:t>
+      </w:r>
+      <w:r>
+        <w:t xml:space="preserve">, Steenburgh, W.J., Evans, A.N., Veals, P., Mace, G.G., Kingsmill, D.E., </w:t>
+      </w:r>
+      <w:r>
+        <w:t xml:space="preserve">and </w:t>
+      </w:r>
+      <w:r>
+        <w:t>Chase, R.J.,</w:t>
+      </w:r>
+      <w:r>
+        <w:t xml:space="preserve"> </w:t>
+      </w:r>
+      <w:r>
+        <w:t>202</w:t>
+      </w:r>
+      <w:r>
+        <w:t>5</w:t>
+      </w:r>
+      <w:r>
+        <w:t>:</w:t>
+      </w:r>
+      <w:r>
+        <w:rPr>
+          <w:spacing w:val="-2"/>
+        </w:rPr>
+        <w:t xml:space="preserve"> </w:t>
+      </w:r>
+      <w:r>
+        <w:t>“</w:t>
+      </w:r>
+      <w:r>
+        <w:t>Orographic Influences on Precipitation in a Continental Mountain Environment as Observed by Mountain and Valley Profiling Radars</w:t>
+      </w:r>
+      <w:r>
+        <w:t xml:space="preserve">”, </w:t>
+      </w:r>
+      <w:r>
+        <w:t>37</w:t>
+      </w:r>
+      <w:r>
+        <w:rPr>
+          <w:vertAlign w:val="superscript"/>
+        </w:rPr>
+        <w:t>th</w:t>
+      </w:r>
+      <w:r>
+        <w:t xml:space="preserve"> International Conference on Alpine Meteorology, Poreč, HR.</w:t>
+      </w:r>
+    </w:p>
+    <w:p>
+      <w:pPr>
+        <w:pStyle w:val="Heading1"/>
+        <w:rPr>
+          <w:spacing w:val="-2"/>
+        </w:rPr>
+      </w:pPr>
+    </w:p>
+    <w:p>
+      <w:pPr>
+        <w:ind w:left="118"/>
+      </w:pPr>
+      <w:r>
         <w:t xml:space="preserve">Kingsmill, D.E., </w:t>
       </w:r>
       <w:r>
@@ -2223,110 +2324,237 @@
         <w:t>Wasserstein, M.L.</w:t>
       </w:r>
       <w:r>
-        <w:t xml:space="preserve">, </w:t>
-      </w:r>
-      <w:proofErr w:type="spellStart"/>
-      <w:r>
-        <w:t>Geerts</w:t>
-      </w:r>
-      <w:proofErr w:type="spellEnd"/>
-      <w:r>
-        <w:t xml:space="preserve">, B.N., and </w:t>
-      </w:r>
-      <w:proofErr w:type="spellStart"/>
+        <w:t xml:space="preserve">, Geerts, B.N., and </w:t>
+      </w:r>
       <w:r>
         <w:rPr>
           <w:sz w:val="24"/>
           <w:szCs w:val="24"/>
         </w:rPr>
-        <w:t>Steenburgh</w:t>
-      </w:r>
-      <w:proofErr w:type="spellEnd"/>
+        <w:t>Steenburgh, W.J., 2024:</w:t>
+      </w:r>
+      <w:r>
+        <w:rPr>
+          <w:spacing w:val="-2"/>
+        </w:rPr>
+        <w:t xml:space="preserve"> </w:t>
+      </w:r>
+      <w:r>
+        <w:t>“</w:t>
+      </w:r>
+      <w:r>
+        <w:t>Multiscale Mountain Waves associated with Orographic Precipitation over Basin and Range Topography</w:t>
+      </w:r>
+      <w:r>
+        <w:t>”, 21</w:t>
+      </w:r>
+      <w:r>
+        <w:rPr>
+          <w:vertAlign w:val="superscript"/>
+        </w:rPr>
+        <w:t>st</w:t>
+      </w:r>
+      <w:r>
+        <w:t xml:space="preserve"> </w:t>
+      </w:r>
+      <w:r>
+        <w:t xml:space="preserve">Conference on </w:t>
+      </w:r>
+      <w:r>
+        <w:t>Mountain Meteorology, AMS, Boise, ID.</w:t>
+      </w:r>
+    </w:p>
+    <w:p>
+      <w:pPr>
+        <w:pStyle w:val="Heading1"/>
+        <w:rPr>
+          <w:spacing w:val="-2"/>
+        </w:rPr>
+      </w:pPr>
+    </w:p>
+    <w:p>
+      <w:pPr>
+        <w:pStyle w:val="BodyText"/>
+        <w:ind w:left="119" w:right="116" w:hanging="1"/>
+      </w:pPr>
+      <w:r>
+        <w:rPr>
+          <w:b/>
+          <w:bCs/>
+        </w:rPr>
+        <w:t>Wasserstein, M.L.</w:t>
+      </w:r>
+      <w:r>
+        <w:t xml:space="preserve"> and </w:t>
+      </w:r>
       <w:r>
         <w:rPr>
           <w:sz w:val="24"/>
           <w:szCs w:val="24"/>
         </w:rPr>
-        <w:t>, W.J., 2024:</w:t>
-      </w:r>
-      <w:r>
-        <w:rPr>
-          <w:spacing w:val="-2"/>
-        </w:rPr>
-        <w:t xml:space="preserve"> </w:t>
-      </w:r>
-      <w:r>
-        <w:t>“</w:t>
-      </w:r>
-      <w:r>
-        <w:t>Multiscale Mountain Waves associated with Orographic Precipitation over Basin and Range Topography</w:t>
-      </w:r>
-      <w:r>
-        <w:t>”, 21</w:t>
-      </w:r>
-      <w:r>
-        <w:rPr>
-          <w:vertAlign w:val="superscript"/>
-        </w:rPr>
-        <w:t>st</w:t>
-      </w:r>
-      <w:r>
-        <w:t xml:space="preserve"> Mountain Meteorology, AMS, Boise, ID.</w:t>
-      </w:r>
-    </w:p>
-    <w:p>
-      <w:pPr>
-        <w:pStyle w:val="Heading1"/>
-        <w:rPr>
-          <w:spacing w:val="-2"/>
-        </w:rPr>
-      </w:pPr>
-    </w:p>
-    <w:p>
-      <w:pPr>
-        <w:pStyle w:val="BodyText"/>
-        <w:spacing w:before="92"/>
-        <w:ind w:left="119" w:right="116" w:hanging="1"/>
-      </w:pPr>
-      <w:r>
-        <w:rPr>
-          <w:b/>
-          <w:bCs/>
-        </w:rPr>
-        <w:t>Wasserstein, M.L.</w:t>
-      </w:r>
-      <w:r>
-        <w:t xml:space="preserve"> and </w:t>
-      </w:r>
-      <w:proofErr w:type="spellStart"/>
+        <w:t>Steenburgh, W.J., 202</w:t>
+      </w:r>
       <w:r>
         <w:rPr>
           <w:sz w:val="24"/>
           <w:szCs w:val="24"/>
         </w:rPr>
-        <w:t>Steenburgh</w:t>
-      </w:r>
-      <w:proofErr w:type="spellEnd"/>
+        <w:t>4</w:t>
+      </w:r>
       <w:r>
         <w:rPr>
           <w:sz w:val="24"/>
           <w:szCs w:val="24"/>
         </w:rPr>
-        <w:t>, W.J., 202</w:t>
+        <w:t>:</w:t>
+      </w:r>
+      <w:r>
+        <w:rPr>
+          <w:spacing w:val="-2"/>
+        </w:rPr>
+        <w:t xml:space="preserve"> </w:t>
+      </w:r>
+      <w:r>
+        <w:t>“</w:t>
+      </w:r>
+      <w:r>
+        <w:t>Diverse Characteristics of Extreme Orographic Snowfall Events in Little Cottonwood Canyon, Utah</w:t>
+      </w:r>
+      <w:r>
+        <w:t xml:space="preserve">”. </w:t>
+      </w:r>
+      <w:r>
+        <w:t>21</w:t>
+      </w:r>
+      <w:r>
+        <w:rPr>
+          <w:vertAlign w:val="superscript"/>
+        </w:rPr>
+        <w:t>st</w:t>
+      </w:r>
+      <w:r>
+        <w:t xml:space="preserve"> Conference on </w:t>
+      </w:r>
+      <w:r>
+        <w:t>Mountain Meteorology, AMS, Boise, ID.</w:t>
+      </w:r>
+    </w:p>
+    <w:p>
+      <w:pPr>
+        <w:pStyle w:val="BodyText"/>
+        <w:ind w:left="119" w:right="116" w:hanging="1"/>
+        <w:rPr>
+          <w:b/>
+        </w:rPr>
+      </w:pPr>
+    </w:p>
+    <w:p>
+      <w:pPr>
+        <w:pStyle w:val="BodyText"/>
+        <w:ind w:left="119" w:right="116" w:hanging="1"/>
+      </w:pPr>
+      <w:r>
+        <w:rPr>
+          <w:b/>
+          <w:bCs/>
+        </w:rPr>
+        <w:t>Wasserstein, M.L.</w:t>
+      </w:r>
+      <w:r>
+        <w:t xml:space="preserve"> and </w:t>
       </w:r>
       <w:r>
         <w:rPr>
           <w:sz w:val="24"/>
           <w:szCs w:val="24"/>
         </w:rPr>
-        <w:t>4</w:t>
+        <w:t>Steenburgh, W.J., 2023:</w:t>
+      </w:r>
+      <w:r>
+        <w:rPr>
+          <w:spacing w:val="-2"/>
+        </w:rPr>
+        <w:t xml:space="preserve"> </w:t>
+      </w:r>
+      <w:r>
+        <w:t>“</w:t>
+      </w:r>
+      <w:r>
+        <w:t>Characteristics of Cool-Season Orographic Precipitation Extremes in the central Wasatch Range, Utah, USA</w:t>
+      </w:r>
+      <w:r>
+        <w:t>”. 36</w:t>
+      </w:r>
+      <w:r>
+        <w:rPr>
+          <w:vertAlign w:val="superscript"/>
+        </w:rPr>
+        <w:t>th</w:t>
+      </w:r>
+      <w:r>
+        <w:t xml:space="preserve"> International Conference on Alpine Meteorology, St. Gallen, CH.</w:t>
+      </w:r>
+    </w:p>
+    <w:p>
+      <w:pPr>
+        <w:pStyle w:val="BodyText"/>
+      </w:pPr>
+    </w:p>
+    <w:p>
+      <w:pPr>
+        <w:pStyle w:val="Heading1"/>
+        <w:rPr>
+          <w:spacing w:val="-2"/>
+        </w:rPr>
+      </w:pPr>
+      <w:bookmarkStart w:id="5" w:name="POSTER_PRESENTATIONS"/>
+      <w:bookmarkEnd w:id="5"/>
+      <w:r>
+        <w:lastRenderedPageBreak/>
+        <w:t>POSTER</w:t>
+      </w:r>
+      <w:r>
+        <w:rPr>
+          <w:spacing w:val="-4"/>
+        </w:rPr>
+        <w:t xml:space="preserve"> </w:t>
+      </w:r>
+      <w:r>
+        <w:rPr>
+          <w:spacing w:val="-2"/>
+        </w:rPr>
+        <w:t>PRESENTATIONS</w:t>
+      </w:r>
+    </w:p>
+    <w:p>
+      <w:pPr>
+        <w:pStyle w:val="Heading1"/>
+        <w:rPr>
+          <w:spacing w:val="-2"/>
+        </w:rPr>
+      </w:pPr>
+    </w:p>
+    <w:p>
+      <w:pPr>
+        <w:pStyle w:val="BodyText"/>
+        <w:ind w:left="119" w:right="116" w:hanging="1"/>
+      </w:pPr>
+      <w:r>
+        <w:rPr>
+          <w:b/>
+          <w:bCs/>
+        </w:rPr>
+        <w:t>Wasserstein, M.L.</w:t>
+      </w:r>
+      <w:r>
+        <w:t xml:space="preserve">, </w:t>
       </w:r>
       <w:r>
         <w:rPr>
           <w:sz w:val="24"/>
           <w:szCs w:val="24"/>
         </w:rPr>
-        <w:t>:</w:t>
+        <w:t>Steenburgh, W.J., Kingsmill, D.E., 2026:</w:t>
       </w:r>
       <w:r>
         <w:rPr>
@@ -2338,31 +2566,31 @@
         <w:t>“</w:t>
       </w:r>
       <w:r>
-        <w:t>Diverse Characteristics of Extreme Orographic Snowfall Events in Little Cottonwood Canyon, Utah</w:t>
-      </w:r>
-      <w:r>
-        <w:t xml:space="preserve">”. </w:t>
-      </w:r>
-      <w:r>
-        <w:t>21st Mountain Meteorology, AMS, Boise, ID.</w:t>
+        <w:t>Multi-ridge Effects on Cool-season Orographic Precipitation in the Wasatch Range, Utah, USA</w:t>
+      </w:r>
+      <w:r>
+        <w:t>”. 22</w:t>
+      </w:r>
+      <w:r>
+        <w:rPr>
+          <w:vertAlign w:val="superscript"/>
+        </w:rPr>
+        <w:t>nd</w:t>
+      </w:r>
+      <w:r>
+        <w:t xml:space="preserve"> Conference on Mountain Meteorology, AMS, Madison, WI.</w:t>
       </w:r>
     </w:p>
     <w:p>
       <w:pPr>
         <w:pStyle w:val="BodyText"/>
-        <w:spacing w:before="92"/>
+        <w:ind w:right="116"/>
+      </w:pPr>
+    </w:p>
+    <w:p>
+      <w:pPr>
+        <w:pStyle w:val="BodyText"/>
         <w:ind w:left="119" w:right="116" w:hanging="1"/>
-        <w:rPr>
-          <w:b/>
-          <w:sz w:val="14"/>
-        </w:rPr>
-      </w:pPr>
-    </w:p>
-    <w:p>
-      <w:pPr>
-        <w:pStyle w:val="BodyText"/>
-        <w:spacing w:before="92"/>
-        <w:ind w:left="119" w:right="116" w:hanging="1"/>
       </w:pPr>
       <w:r>
         <w:rPr>
@@ -2372,23 +2600,74 @@
         <w:t>Wasserstein, M.L.</w:t>
       </w:r>
       <w:r>
-        <w:t xml:space="preserve"> and </w:t>
-      </w:r>
-      <w:proofErr w:type="spellStart"/>
+        <w:t xml:space="preserve">, </w:t>
+      </w:r>
       <w:r>
         <w:rPr>
           <w:sz w:val="24"/>
           <w:szCs w:val="24"/>
         </w:rPr>
-        <w:t>Steenburgh</w:t>
-      </w:r>
-      <w:proofErr w:type="spellEnd"/>
+        <w:t>Steenburgh, W.J., Kingsmill, D.E., 2025:</w:t>
+      </w:r>
+      <w:r>
+        <w:rPr>
+          <w:spacing w:val="-2"/>
+        </w:rPr>
+        <w:t xml:space="preserve"> </w:t>
+      </w:r>
+      <w:r>
+        <w:t>“</w:t>
+      </w:r>
+      <w:r>
+        <w:t>Multi-ridge Effects on Cool-season Orographic Precipitation in the Wasatch Range, Utah, USA</w:t>
+      </w:r>
+      <w:r>
+        <w:t>”. 37</w:t>
+      </w:r>
+      <w:r>
+        <w:rPr>
+          <w:vertAlign w:val="superscript"/>
+        </w:rPr>
+        <w:t>th</w:t>
+      </w:r>
+      <w:r>
+        <w:t xml:space="preserve"> International Conference on Alpine Meteorology, St. Gallen, </w:t>
+      </w:r>
+      <w:r>
+        <w:t>CH</w:t>
+      </w:r>
+      <w:r>
+        <w:t>.</w:t>
+      </w:r>
+    </w:p>
+    <w:p>
+      <w:pPr>
+        <w:ind w:left="118"/>
+      </w:pPr>
+    </w:p>
+    <w:p>
+      <w:pPr>
+        <w:ind w:left="118"/>
+      </w:pPr>
+      <w:r>
+        <w:t xml:space="preserve">Evans, A.N., Veals, P.G., </w:t>
+      </w:r>
+      <w:r>
+        <w:rPr>
+          <w:b/>
+          <w:bCs/>
+        </w:rPr>
+        <w:t>Wasserstein, M.L.</w:t>
+      </w:r>
+      <w:r>
+        <w:t xml:space="preserve">, and </w:t>
+      </w:r>
       <w:r>
         <w:rPr>
           <w:sz w:val="24"/>
           <w:szCs w:val="24"/>
         </w:rPr>
-        <w:t>, W.J., 2023:</w:t>
+        <w:t>Steenburgh, W.J., 2024:</w:t>
       </w:r>
       <w:r>
         <w:rPr>
@@ -2400,75 +2679,41 @@
         <w:t>“</w:t>
       </w:r>
       <w:r>
-        <w:t>Characteristics of Cool-Season Orographic Precipitation Extremes in the central Wasatch Range, Utah, USA</w:t>
-      </w:r>
-      <w:r>
-        <w:t>”. 36</w:t>
+        <w:t>Census of Valley and Mountain Profiling Radar Characteristics during Winter Storms along Utah's Wasatch Front</w:t>
+      </w:r>
+      <w:r>
+        <w:t>”, 21</w:t>
       </w:r>
       <w:r>
         <w:rPr>
           <w:vertAlign w:val="superscript"/>
         </w:rPr>
-        <w:t>th</w:t>
-      </w:r>
-      <w:r>
-        <w:t xml:space="preserve"> International Conference on Alpine Meteorology, St. Gallen, CH.</w:t>
-      </w:r>
-    </w:p>
-    <w:p>
-      <w:pPr>
-        <w:pStyle w:val="BodyText"/>
-      </w:pPr>
+        <w:t>st</w:t>
+      </w:r>
+      <w:r>
+        <w:t xml:space="preserve"> </w:t>
+      </w:r>
+      <w:r>
+        <w:t xml:space="preserve">Conference on </w:t>
+      </w:r>
+      <w:r>
+        <w:t>Mountain Meteorology, AMS, Boise, ID.</w:t>
+      </w:r>
     </w:p>
     <w:p>
       <w:pPr>
         <w:pStyle w:val="Heading1"/>
+        <w:ind w:left="0"/>
         <w:rPr>
           <w:spacing w:val="-2"/>
         </w:rPr>
       </w:pPr>
-      <w:bookmarkStart w:id="5" w:name="POSTER_PRESENTATIONS"/>
-      <w:bookmarkEnd w:id="5"/>
-      <w:r>
-        <w:t>POSTER</w:t>
-      </w:r>
-      <w:r>
-        <w:rPr>
-          <w:spacing w:val="-4"/>
-        </w:rPr>
-        <w:t xml:space="preserve"> </w:t>
-      </w:r>
-      <w:r>
-        <w:rPr>
-          <w:spacing w:val="-2"/>
-        </w:rPr>
-        <w:t>PRESENTATIONS</w:t>
-      </w:r>
-    </w:p>
-    <w:p>
-      <w:pPr>
-        <w:pStyle w:val="Heading1"/>
-        <w:rPr>
-          <w:spacing w:val="-2"/>
-        </w:rPr>
-      </w:pPr>
     </w:p>
     <w:p>
       <w:pPr>
         <w:ind w:left="118"/>
       </w:pPr>
       <w:r>
-        <w:t xml:space="preserve">Evans, A.N., </w:t>
-      </w:r>
-      <w:proofErr w:type="spellStart"/>
-      <w:r>
-        <w:t>Veals</w:t>
-      </w:r>
-      <w:proofErr w:type="spellEnd"/>
-      <w:r>
-        <w:t xml:space="preserve">, P.G., </w:t>
-      </w:r>
-      <w:r>
         <w:rPr>
           <w:b/>
           <w:bCs/>
@@ -2478,21 +2723,76 @@
       <w:r>
         <w:t xml:space="preserve">, and </w:t>
       </w:r>
-      <w:proofErr w:type="spellStart"/>
       <w:r>
         <w:rPr>
           <w:sz w:val="24"/>
           <w:szCs w:val="24"/>
         </w:rPr>
-        <w:t>Steenburgh</w:t>
+        <w:t>Steenburgh, W.J., 2024:</w:t>
+      </w:r>
+      <w:r>
+        <w:rPr>
+          <w:spacing w:val="-2"/>
+        </w:rPr>
+        <w:t xml:space="preserve"> </w:t>
+      </w:r>
+      <w:r>
+        <w:t>“</w:t>
+      </w:r>
+      <w:r>
+        <w:t>Fine-scale Prediction of Orographic Precipitation in Little Cottonwood Canyon, Utah</w:t>
+      </w:r>
+      <w:r>
+        <w:t>”, 21</w:t>
+      </w:r>
+      <w:r>
+        <w:rPr>
+          <w:vertAlign w:val="superscript"/>
+        </w:rPr>
+        <w:t>st</w:t>
+      </w:r>
+      <w:r>
+        <w:t xml:space="preserve"> </w:t>
+      </w:r>
+      <w:r>
+        <w:t xml:space="preserve">Conference on </w:t>
+      </w:r>
+      <w:r>
+        <w:t>Mountain Meteorology, AMS, Boise, ID.</w:t>
+      </w:r>
+    </w:p>
+    <w:p/>
+    <w:p>
+      <w:pPr>
+        <w:ind w:left="118"/>
+      </w:pPr>
+      <w:r>
+        <w:t xml:space="preserve">Evans, A.N., </w:t>
+      </w:r>
+      <w:proofErr w:type="spellStart"/>
+      <w:r>
+        <w:t>Veals</w:t>
       </w:r>
       <w:proofErr w:type="spellEnd"/>
+      <w:r>
+        <w:t xml:space="preserve">, P., </w:t>
+      </w:r>
+      <w:r>
+        <w:rPr>
+          <w:b/>
+          <w:bCs/>
+        </w:rPr>
+        <w:t>Wasserstein, M.L.</w:t>
+      </w:r>
+      <w:r>
+        <w:t xml:space="preserve">, and </w:t>
+      </w:r>
       <w:r>
         <w:rPr>
           <w:sz w:val="24"/>
           <w:szCs w:val="24"/>
         </w:rPr>
-        <w:t>, W.J., 2024:</w:t>
+        <w:t>Steenburgh, W.J., 2023:</w:t>
       </w:r>
       <w:r>
         <w:rPr>
@@ -2507,133 +2807,119 @@
         <w:t>Census of Valley and Mountain Profiling Radar Characteristics during Winter Storms along Utah's Wasatch Front</w:t>
       </w:r>
       <w:r>
-        <w:t>”, 21</w:t>
+        <w:t>”, 32</w:t>
       </w:r>
       <w:r>
         <w:rPr>
           <w:vertAlign w:val="superscript"/>
         </w:rPr>
-        <w:t>st</w:t>
-      </w:r>
-      <w:r>
-        <w:t xml:space="preserve"> Mountain Meteorology, AMS, Boise, ID.</w:t>
-      </w:r>
-    </w:p>
-    <w:p>
-      <w:pPr>
-        <w:pStyle w:val="Heading1"/>
-        <w:ind w:left="0"/>
-        <w:rPr>
-          <w:spacing w:val="-2"/>
-        </w:rPr>
-      </w:pPr>
-    </w:p>
-    <w:p>
-      <w:pPr>
-        <w:ind w:left="118"/>
-      </w:pPr>
-      <w:r>
+        <w:t>nd</w:t>
+      </w:r>
+      <w:r>
+        <w:t xml:space="preserve"> Conference on Weather Analysis and Forecasting, AMS, Madison, WI.</w:t>
+      </w:r>
+    </w:p>
+    <w:p>
+      <w:pPr>
+        <w:pStyle w:val="BodyText"/>
+        <w:ind w:left="119" w:right="116" w:hanging="1"/>
         <w:rPr>
           <w:b/>
           <w:bCs/>
         </w:rPr>
+      </w:pPr>
+    </w:p>
+    <w:p>
+      <w:pPr>
+        <w:pStyle w:val="BodyText"/>
+        <w:ind w:left="119" w:right="116" w:hanging="1"/>
+      </w:pPr>
+      <w:r>
+        <w:rPr>
+          <w:b/>
+          <w:bCs/>
+        </w:rPr>
         <w:t>Wasserstein, M.L.</w:t>
       </w:r>
       <w:r>
-        <w:t xml:space="preserve">, and </w:t>
-      </w:r>
-      <w:proofErr w:type="spellStart"/>
+        <w:t xml:space="preserve">, </w:t>
+      </w:r>
       <w:r>
         <w:rPr>
           <w:sz w:val="24"/>
           <w:szCs w:val="24"/>
         </w:rPr>
-        <w:t>Steenburgh</w:t>
-      </w:r>
-      <w:proofErr w:type="spellEnd"/>
+        <w:t xml:space="preserve">Steenburgh, W.J., Veals, P., </w:t>
+      </w:r>
       <w:r>
         <w:rPr>
           <w:sz w:val="24"/>
           <w:szCs w:val="24"/>
         </w:rPr>
-        <w:t>, W.J., 2024:</w:t>
-      </w:r>
-      <w:r>
-        <w:rPr>
-          <w:spacing w:val="-2"/>
-        </w:rPr>
-        <w:t xml:space="preserve"> </w:t>
-      </w:r>
-      <w:r>
-        <w:t>“</w:t>
-      </w:r>
-      <w:r>
-        <w:t>Fine-scale Prediction of Orographic Precipitation in Little Cottonwood Canyon, Utah</w:t>
-      </w:r>
-      <w:r>
-        <w:t>”, 21</w:t>
-      </w:r>
-      <w:r>
-        <w:rPr>
-          <w:vertAlign w:val="superscript"/>
-        </w:rPr>
-        <w:t>st</w:t>
-      </w:r>
-      <w:r>
-        <w:t xml:space="preserve"> Mountain Meteorology, AMS, Boise, ID.</w:t>
-      </w:r>
-    </w:p>
-    <w:p/>
-    <w:p>
-      <w:pPr>
-        <w:pStyle w:val="BodyText"/>
-        <w:spacing w:before="1"/>
-        <w:rPr>
-          <w:b/>
-          <w:sz w:val="14"/>
-        </w:rPr>
-      </w:pPr>
-    </w:p>
-    <w:p>
-      <w:pPr>
-        <w:ind w:left="118"/>
-      </w:pPr>
-      <w:r>
-        <w:t xml:space="preserve">Evans, A.N., </w:t>
-      </w:r>
-      <w:proofErr w:type="spellStart"/>
-      <w:r>
-        <w:t>Veals</w:t>
-      </w:r>
-      <w:proofErr w:type="spellEnd"/>
-      <w:r>
-        <w:t xml:space="preserve">, P., </w:t>
-      </w:r>
-      <w:r>
-        <w:rPr>
-          <w:b/>
-          <w:bCs/>
-        </w:rPr>
-        <w:t>Wasserstein, M.L.</w:t>
-      </w:r>
-      <w:r>
-        <w:t xml:space="preserve">, and </w:t>
-      </w:r>
-      <w:proofErr w:type="spellStart"/>
+        <w:t>Kingsmill, D.E.</w:t>
+      </w:r>
       <w:r>
         <w:rPr>
           <w:sz w:val="24"/>
           <w:szCs w:val="24"/>
         </w:rPr>
-        <w:t>Steenburgh</w:t>
-      </w:r>
-      <w:proofErr w:type="spellEnd"/>
+        <w:t>, Evans, A. 2023:</w:t>
+      </w:r>
+      <w:r>
+        <w:rPr>
+          <w:spacing w:val="-2"/>
+        </w:rPr>
+        <w:t xml:space="preserve"> </w:t>
+      </w:r>
+      <w:r>
+        <w:t>“</w:t>
+      </w:r>
+      <w:r>
+        <w:t>Observations of the Characteristics of Cool-Season Precipitation in the Salt Lake Valley and Adjacent Central Wasatch Range of Utah, USA</w:t>
+      </w:r>
+      <w:r>
+        <w:t>”. 36</w:t>
+      </w:r>
+      <w:r>
+        <w:rPr>
+          <w:vertAlign w:val="superscript"/>
+        </w:rPr>
+        <w:t>th</w:t>
+      </w:r>
+      <w:r>
+        <w:t xml:space="preserve"> International Conference on Alpine Meteorology, St. Gallen, CH.</w:t>
+      </w:r>
+    </w:p>
+    <w:p>
+      <w:pPr>
+        <w:pStyle w:val="BodyText"/>
+        <w:ind w:left="119" w:right="116" w:hanging="1"/>
+      </w:pPr>
+    </w:p>
+    <w:p>
+      <w:pPr>
+        <w:pStyle w:val="BodyText"/>
+        <w:ind w:left="119" w:right="116" w:hanging="1"/>
+      </w:pPr>
+      <w:r>
+        <w:t xml:space="preserve">Lombardo, S.J., </w:t>
+      </w:r>
+      <w:r>
+        <w:rPr>
+          <w:b/>
+          <w:bCs/>
+        </w:rPr>
+        <w:t>Wasserstein, M.L.</w:t>
+      </w:r>
+      <w:r>
+        <w:t xml:space="preserve">, Veals, P., and </w:t>
+      </w:r>
       <w:r>
         <w:rPr>
           <w:sz w:val="24"/>
           <w:szCs w:val="24"/>
         </w:rPr>
-        <w:t>, W.J., 2023:</w:t>
+        <w:t>Steenburgh, W.J., 2022:</w:t>
       </w:r>
       <w:r>
         <w:rPr>
@@ -2645,251 +2931,205 @@
         <w:t>“</w:t>
       </w:r>
       <w:r>
-        <w:t>Census of Valley and Mountain Profiling Radar Characteristics during Winter Storms along Utah's Wasatch Front</w:t>
-      </w:r>
-      <w:r>
-        <w:t>”, 32</w:t>
-      </w:r>
-      <w:r>
-        <w:rPr>
-          <w:vertAlign w:val="superscript"/>
-        </w:rPr>
-        <w:t>nd</w:t>
-      </w:r>
-      <w:r>
-        <w:t xml:space="preserve"> Conference on Weather Analysis and Forecasting, AMS, Madison, WI.</w:t>
+        <w:t>Verification and Bias Correction of Global Forecast System (GFS) Precipitation Forecasts in Little Cottonwood Canyon.</w:t>
+      </w:r>
+      <w:r>
+        <w:t xml:space="preserve"> </w:t>
+      </w:r>
+      <w:r>
+        <w:t>REALM Student Poster Session, University of Utah, Salt Lake City, UT.</w:t>
       </w:r>
     </w:p>
     <w:p>
       <w:pPr>
         <w:pStyle w:val="BodyText"/>
-        <w:spacing w:before="92"/>
+      </w:pPr>
+    </w:p>
+    <w:p>
+      <w:pPr>
+        <w:pStyle w:val="BodyText"/>
         <w:ind w:left="119" w:right="116" w:hanging="1"/>
+      </w:pPr>
+      <w:r>
         <w:rPr>
           <w:b/>
           <w:bCs/>
         </w:rPr>
-      </w:pPr>
-    </w:p>
-    <w:p>
-      <w:pPr>
-        <w:pStyle w:val="BodyText"/>
-        <w:spacing w:before="92"/>
-        <w:ind w:left="119" w:right="116" w:hanging="1"/>
-      </w:pPr>
-      <w:r>
-        <w:rPr>
-          <w:b/>
-          <w:bCs/>
-        </w:rPr>
         <w:t>Wasserstein, M.L.</w:t>
       </w:r>
       <w:r>
-        <w:t xml:space="preserve">, </w:t>
-      </w:r>
-      <w:proofErr w:type="spellStart"/>
+        <w:t xml:space="preserve"> and </w:t>
+      </w:r>
       <w:r>
         <w:rPr>
           <w:sz w:val="24"/>
           <w:szCs w:val="24"/>
         </w:rPr>
-        <w:t>Steenburgh</w:t>
-      </w:r>
-      <w:proofErr w:type="spellEnd"/>
+        <w:t>Steenburgh, W.J., 2022:</w:t>
+      </w:r>
+      <w:r>
+        <w:rPr>
+          <w:spacing w:val="-2"/>
+        </w:rPr>
+        <w:t xml:space="preserve"> </w:t>
+      </w:r>
+      <w:r>
+        <w:t>“</w:t>
+      </w:r>
+      <w:r>
+        <w:t>Impacts of Dry Sub-Cloud Layers on Orographic Precipitation</w:t>
+      </w:r>
+      <w:r>
+        <w:t>”, 20</w:t>
+      </w:r>
+      <w:r>
+        <w:rPr>
+          <w:vertAlign w:val="superscript"/>
+        </w:rPr>
+        <w:t>th</w:t>
+      </w:r>
+      <w:r>
+        <w:t xml:space="preserve"> Conference on Mountain Meteorology, AMS, Park City, UT.</w:t>
+      </w:r>
+    </w:p>
+    <w:p>
+      <w:pPr>
+        <w:pStyle w:val="BodyText"/>
+        <w:ind w:left="119" w:right="116" w:hanging="1"/>
+      </w:pPr>
+    </w:p>
+    <w:p>
+      <w:pPr>
+        <w:pStyle w:val="Heading1"/>
+        <w:rPr>
+          <w:spacing w:val="-2"/>
+        </w:rPr>
+      </w:pPr>
+      <w:r>
+        <w:t>GENERAL</w:t>
+      </w:r>
+    </w:p>
+    <w:p>
+      <w:pPr>
+        <w:pStyle w:val="BodyText"/>
+        <w:ind w:left="119" w:right="116" w:hanging="1"/>
+      </w:pPr>
+    </w:p>
+    <w:p>
+      <w:pPr>
+        <w:pStyle w:val="BodyText"/>
+        <w:ind w:left="119" w:right="116" w:hanging="1"/>
+      </w:pPr>
+      <w:r>
+        <w:rPr>
+          <w:b/>
+          <w:bCs/>
+        </w:rPr>
+        <w:t>Wasserstein, M. L.</w:t>
+      </w:r>
+      <w:r>
+        <w:t>,</w:t>
+      </w:r>
+      <w:r>
+        <w:t xml:space="preserve"> Evans, A. L., Veals, P. G., Kingsmill, D. E., and Steenburgh, W.J.,</w:t>
+      </w:r>
       <w:r>
         <w:rPr>
           <w:sz w:val="24"/>
           <w:szCs w:val="24"/>
         </w:rPr>
-        <w:t xml:space="preserve">, W.J., </w:t>
-      </w:r>
-      <w:proofErr w:type="spellStart"/>
+        <w:t xml:space="preserve"> 2025:</w:t>
+      </w:r>
+      <w:r>
+        <w:rPr>
+          <w:spacing w:val="-2"/>
+        </w:rPr>
+        <w:t xml:space="preserve"> </w:t>
+      </w:r>
+      <w:r>
+        <w:t>“</w:t>
+      </w:r>
+      <w:r>
+        <w:t>Orographic Influences on Precipitation in a Continental Mountain Environment as Observed by Mountain and Valley Profiling Radars</w:t>
+      </w:r>
+      <w:r>
+        <w:t>”</w:t>
+      </w:r>
+      <w:r>
+        <w:t>,</w:t>
+      </w:r>
+      <w:r>
+        <w:t xml:space="preserve"> 2</w:t>
+      </w:r>
+      <w:r>
+        <w:rPr>
+          <w:vertAlign w:val="superscript"/>
+        </w:rPr>
+        <w:t>nd</w:t>
+      </w:r>
+      <w:r>
+        <w:t xml:space="preserve"> Utah Snow Symposium, Salt Lake City, UT.</w:t>
+      </w:r>
+    </w:p>
+    <w:p>
+      <w:pPr>
+        <w:pStyle w:val="BodyText"/>
+        <w:ind w:left="119" w:right="116" w:hanging="1"/>
+      </w:pPr>
+    </w:p>
+    <w:p>
+      <w:pPr>
+        <w:pStyle w:val="BodyText"/>
+        <w:ind w:left="119" w:right="116" w:hanging="1"/>
+      </w:pPr>
+      <w:r>
+        <w:rPr>
+          <w:b/>
+          <w:bCs/>
+        </w:rPr>
+        <w:t>Wasserstein, M.L.</w:t>
+      </w:r>
+      <w:r>
+        <w:t xml:space="preserve"> and </w:t>
+      </w:r>
       <w:r>
         <w:rPr>
           <w:sz w:val="24"/>
           <w:szCs w:val="24"/>
         </w:rPr>
-        <w:t>Veals</w:t>
-      </w:r>
-      <w:proofErr w:type="spellEnd"/>
-      <w:r>
-        <w:rPr>
-          <w:sz w:val="24"/>
-          <w:szCs w:val="24"/>
-        </w:rPr>
-        <w:t>, P., Kingsmill, D., Evans, A. 2023:</w:t>
+        <w:t>Steenburgh, W.J., 2024:</w:t>
       </w:r>
       <w:r>
         <w:rPr>
           <w:spacing w:val="-2"/>
         </w:rPr>
-        <w:t xml:space="preserve"> </w:t>
-      </w:r>
-      <w:r>
-        <w:t>“</w:t>
-      </w:r>
-      <w:r>
-        <w:t>Observations of the Characteristics of Cool-Season Precipitation in the Salt Lake Valley and Adjacent Central Wasatch Range of Utah, USA</w:t>
-      </w:r>
-      <w:r>
-        <w:t>”. 36</w:t>
+        <w:t xml:space="preserve"> “</w:t>
+      </w:r>
+      <w:r>
+        <w:t>Fine-scale prediction of orographic precipitation in multi-ridge orography</w:t>
+      </w:r>
+      <w:r>
+        <w:t>”, 1</w:t>
       </w:r>
       <w:r>
         <w:rPr>
           <w:vertAlign w:val="superscript"/>
         </w:rPr>
-        <w:t>th</w:t>
-      </w:r>
-      <w:r>
-        <w:t xml:space="preserve"> International Conference on Alpine Meteorology, St. Gallen, CH.</w:t>
+        <w:t>st</w:t>
+      </w:r>
+      <w:r>
+        <w:t xml:space="preserve"> Utah Snow Symposium, Salt Lake City, UT.</w:t>
       </w:r>
     </w:p>
     <w:p>
       <w:pPr>
         <w:pStyle w:val="BodyText"/>
-        <w:spacing w:before="92"/>
         <w:ind w:left="119" w:right="116" w:hanging="1"/>
       </w:pPr>
     </w:p>
     <w:p>
       <w:pPr>
         <w:pStyle w:val="BodyText"/>
-        <w:spacing w:before="92"/>
-        <w:ind w:left="119" w:right="116" w:hanging="1"/>
-      </w:pPr>
-      <w:r>
-        <w:t xml:space="preserve">Lombardo, S.J., </w:t>
-      </w:r>
-      <w:r>
-        <w:rPr>
-          <w:b/>
-          <w:bCs/>
-        </w:rPr>
-        <w:t>Wasserstein, M.L.</w:t>
-      </w:r>
-      <w:r>
-        <w:t xml:space="preserve">, </w:t>
-      </w:r>
-      <w:proofErr w:type="spellStart"/>
-      <w:r>
-        <w:t>Veals</w:t>
-      </w:r>
-      <w:proofErr w:type="spellEnd"/>
-      <w:r>
-        <w:t xml:space="preserve">, P., and </w:t>
-      </w:r>
-      <w:proofErr w:type="spellStart"/>
-      <w:r>
-        <w:rPr>
-          <w:sz w:val="24"/>
-          <w:szCs w:val="24"/>
-        </w:rPr>
-        <w:t>Steenburgh</w:t>
-      </w:r>
-      <w:proofErr w:type="spellEnd"/>
-      <w:r>
-        <w:rPr>
-          <w:sz w:val="24"/>
-          <w:szCs w:val="24"/>
-        </w:rPr>
-        <w:t>, W.J., 2022:</w:t>
-      </w:r>
-      <w:r>
-        <w:rPr>
-          <w:spacing w:val="-2"/>
-        </w:rPr>
-        <w:t xml:space="preserve"> </w:t>
-      </w:r>
-      <w:r>
-        <w:t>“</w:t>
-      </w:r>
-      <w:r>
-        <w:t>Verification and Bias Correction of Global Forecast System (GFS) Precipitation Forecasts in Little Cottonwood Canyon.</w:t>
-      </w:r>
-      <w:r>
-        <w:t xml:space="preserve"> </w:t>
-      </w:r>
-      <w:r>
-        <w:t>REALM Student Poster Session, University of Utah, Salt Lake City, UT.</w:t>
-      </w:r>
-    </w:p>
-    <w:p>
-      <w:pPr>
-        <w:pStyle w:val="BodyText"/>
-        <w:spacing w:before="10"/>
-        <w:rPr>
-          <w:sz w:val="21"/>
-        </w:rPr>
-      </w:pPr>
-    </w:p>
-    <w:p>
-      <w:pPr>
-        <w:pStyle w:val="BodyText"/>
-        <w:spacing w:before="92"/>
-        <w:ind w:left="119" w:right="116" w:hanging="1"/>
-      </w:pPr>
-      <w:r>
-        <w:rPr>
-          <w:b/>
-          <w:bCs/>
-        </w:rPr>
-        <w:t>Wasserstein, M.L.</w:t>
-      </w:r>
-      <w:r>
-        <w:t xml:space="preserve"> and </w:t>
-      </w:r>
-      <w:proofErr w:type="spellStart"/>
-      <w:r>
-        <w:rPr>
-          <w:sz w:val="24"/>
-          <w:szCs w:val="24"/>
-        </w:rPr>
-        <w:t>Steenburgh</w:t>
-      </w:r>
-      <w:proofErr w:type="spellEnd"/>
-      <w:r>
-        <w:rPr>
-          <w:sz w:val="24"/>
-          <w:szCs w:val="24"/>
-        </w:rPr>
-        <w:t>, W.J., 2022:</w:t>
-      </w:r>
-      <w:r>
-        <w:rPr>
-          <w:spacing w:val="-2"/>
-        </w:rPr>
-        <w:t xml:space="preserve"> </w:t>
-      </w:r>
-      <w:r>
-        <w:t>“</w:t>
-      </w:r>
-      <w:r>
-        <w:t>Impacts of Dry Sub-Cloud Layers on Orographic Precipitation</w:t>
-      </w:r>
-      <w:r>
-        <w:t>”, 20</w:t>
-      </w:r>
-      <w:r>
-        <w:rPr>
-          <w:vertAlign w:val="superscript"/>
-        </w:rPr>
-        <w:t>th</w:t>
-      </w:r>
-      <w:r>
-        <w:t xml:space="preserve"> Conference on Mountain Meteorology, AMS, Park City, UT.</w:t>
-      </w:r>
-    </w:p>
-    <w:p>
-      <w:pPr>
-        <w:pStyle w:val="BodyText"/>
-        <w:spacing w:before="92"/>
-        <w:ind w:left="119" w:right="116" w:hanging="1"/>
-      </w:pPr>
-    </w:p>
-    <w:p>
-      <w:pPr>
-        <w:pStyle w:val="BodyText"/>
-        <w:spacing w:before="92"/>
         <w:ind w:left="119" w:right="116" w:hanging="1"/>
         <w:rPr>
           <w:b/>
@@ -2909,61 +3149,49 @@
     <w:p>
       <w:pPr>
         <w:pStyle w:val="BodyText"/>
-        <w:spacing w:before="92"/>
         <w:ind w:right="116"/>
       </w:pPr>
     </w:p>
     <w:p>
       <w:pPr>
         <w:pStyle w:val="BodyText"/>
-        <w:spacing w:before="92"/>
         <w:ind w:left="119" w:right="116" w:hanging="1"/>
       </w:pPr>
-      <w:proofErr w:type="spellStart"/>
-      <w:r>
-        <w:t>Steenburgh</w:t>
-      </w:r>
-      <w:proofErr w:type="spellEnd"/>
+      <w:r>
+        <w:t xml:space="preserve">Steenburgh, </w:t>
+      </w:r>
+      <w:r>
+        <w:t>J.</w:t>
+      </w:r>
       <w:r>
         <w:t xml:space="preserve">, </w:t>
       </w:r>
       <w:r>
-        <w:t>J.</w:t>
+        <w:rPr>
+          <w:b/>
+          <w:bCs/>
+        </w:rPr>
+        <w:t>Wasserstein</w:t>
+      </w:r>
+      <w:r>
+        <w:rPr>
+          <w:b/>
+          <w:bCs/>
+        </w:rPr>
+        <w:t>,</w:t>
+      </w:r>
+      <w:r>
+        <w:rPr>
+          <w:b/>
+          <w:bCs/>
+        </w:rPr>
+        <w:t xml:space="preserve"> M. L.</w:t>
       </w:r>
       <w:r>
         <w:t xml:space="preserve">, </w:t>
       </w:r>
       <w:r>
-        <w:rPr>
-          <w:b/>
-          <w:bCs/>
-        </w:rPr>
-        <w:t>Wasserstein</w:t>
-      </w:r>
-      <w:r>
-        <w:rPr>
-          <w:b/>
-          <w:bCs/>
-        </w:rPr>
-        <w:t>,</w:t>
-      </w:r>
-      <w:r>
-        <w:rPr>
-          <w:b/>
-          <w:bCs/>
-        </w:rPr>
-        <w:t xml:space="preserve"> M. L.</w:t>
-      </w:r>
-      <w:r>
-        <w:t xml:space="preserve">, </w:t>
-      </w:r>
-      <w:proofErr w:type="spellStart"/>
-      <w:r>
-        <w:t>Veals</w:t>
-      </w:r>
-      <w:proofErr w:type="spellEnd"/>
-      <w:r>
-        <w:t>, P. G</w:t>
+        <w:t>Veals, P. G</w:t>
       </w:r>
       <w:r>
         <w:t>. 2025. "</w:t>
@@ -2977,7 +3205,7 @@
       <w:r>
         <w:t xml:space="preserve"> </w:t>
       </w:r>
-      <w:hyperlink r:id="rId7" w:history="1">
+      <w:hyperlink r:id="rId9" w:history="1">
         <w:r>
           <w:rPr>
             <w:rStyle w:val="Hyperlink"/>
@@ -2992,61 +3220,49 @@
     <w:p>
       <w:pPr>
         <w:pStyle w:val="BodyText"/>
-        <w:spacing w:before="92"/>
         <w:ind w:left="119" w:right="116" w:hanging="1"/>
       </w:pPr>
     </w:p>
     <w:p>
       <w:pPr>
         <w:pStyle w:val="BodyText"/>
-        <w:spacing w:before="92"/>
         <w:ind w:left="119" w:right="116" w:hanging="1"/>
       </w:pPr>
-      <w:proofErr w:type="spellStart"/>
-      <w:r>
-        <w:t>Steenburgh</w:t>
-      </w:r>
-      <w:proofErr w:type="spellEnd"/>
+      <w:r>
+        <w:t xml:space="preserve">Steenburgh, </w:t>
+      </w:r>
+      <w:r>
+        <w:t>J.</w:t>
+      </w:r>
       <w:r>
         <w:t xml:space="preserve">, </w:t>
       </w:r>
       <w:r>
-        <w:t>J.</w:t>
+        <w:rPr>
+          <w:b/>
+          <w:bCs/>
+        </w:rPr>
+        <w:t>Wasserstein</w:t>
+      </w:r>
+      <w:r>
+        <w:rPr>
+          <w:b/>
+          <w:bCs/>
+        </w:rPr>
+        <w:t>,</w:t>
+      </w:r>
+      <w:r>
+        <w:rPr>
+          <w:b/>
+          <w:bCs/>
+        </w:rPr>
+        <w:t xml:space="preserve"> M. L.</w:t>
       </w:r>
       <w:r>
         <w:t xml:space="preserve">, </w:t>
       </w:r>
       <w:r>
-        <w:rPr>
-          <w:b/>
-          <w:bCs/>
-        </w:rPr>
-        <w:t>Wasserstein</w:t>
-      </w:r>
-      <w:r>
-        <w:rPr>
-          <w:b/>
-          <w:bCs/>
-        </w:rPr>
-        <w:t>,</w:t>
-      </w:r>
-      <w:r>
-        <w:rPr>
-          <w:b/>
-          <w:bCs/>
-        </w:rPr>
-        <w:t xml:space="preserve"> M. L.</w:t>
-      </w:r>
-      <w:r>
-        <w:t xml:space="preserve">, </w:t>
-      </w:r>
-      <w:proofErr w:type="spellStart"/>
-      <w:r>
-        <w:t>Veals</w:t>
-      </w:r>
-      <w:proofErr w:type="spellEnd"/>
-      <w:r>
-        <w:t>, P. G</w:t>
+        <w:t>Veals, P. G</w:t>
       </w:r>
       <w:r>
         <w:t>. 2025. "</w:t>
@@ -3066,7 +3282,7 @@
       <w:r>
         <w:t xml:space="preserve"> </w:t>
       </w:r>
-      <w:hyperlink r:id="rId8" w:history="1">
+      <w:hyperlink r:id="rId10" w:history="1">
         <w:r>
           <w:rPr>
             <w:rStyle w:val="Hyperlink"/>
@@ -3081,98 +3297,80 @@
     <w:p>
       <w:pPr>
         <w:pStyle w:val="BodyText"/>
-        <w:spacing w:before="92"/>
         <w:ind w:right="116"/>
       </w:pPr>
     </w:p>
     <w:p>
       <w:pPr>
         <w:pStyle w:val="BodyText"/>
-        <w:spacing w:before="92"/>
         <w:ind w:left="119" w:right="116" w:hanging="1"/>
       </w:pPr>
+      <w:r>
+        <w:t xml:space="preserve">Steenburgh, </w:t>
+      </w:r>
+      <w:r>
+        <w:t>J.</w:t>
+      </w:r>
+      <w:r>
+        <w:t xml:space="preserve">, </w:t>
+      </w:r>
+      <w:r>
+        <w:rPr>
+          <w:b/>
+          <w:bCs/>
+        </w:rPr>
+        <w:t>Wasserstein</w:t>
+      </w:r>
+      <w:r>
+        <w:rPr>
+          <w:b/>
+          <w:bCs/>
+        </w:rPr>
+        <w:t>,</w:t>
+      </w:r>
+      <w:r>
+        <w:rPr>
+          <w:b/>
+          <w:bCs/>
+        </w:rPr>
+        <w:t xml:space="preserve"> M. L.</w:t>
+      </w:r>
+      <w:r>
+        <w:t xml:space="preserve">, </w:t>
+      </w:r>
+      <w:r>
+        <w:t>Veals, P. G.</w:t>
+      </w:r>
+      <w:r>
+        <w:t xml:space="preserve">, </w:t>
+      </w:r>
+      <w:r>
+        <w:t>Evans, A.</w:t>
+      </w:r>
+      <w:r>
+        <w:t xml:space="preserve">, and </w:t>
+      </w:r>
+      <w:r>
+        <w:t>Kingsmill, D.E.</w:t>
+      </w:r>
+      <w:r>
+        <w:t xml:space="preserve"> 2025. "</w:t>
+      </w:r>
+      <w:r>
+        <w:t>Alta Atwater</w:t>
+      </w:r>
+      <w:r>
+        <w:t xml:space="preserve"> PARSIVEL </w:t>
+      </w:r>
       <w:proofErr w:type="spellStart"/>
       <w:r>
-        <w:t>Steenburgh</w:t>
+        <w:t>Disdrometer</w:t>
       </w:r>
       <w:proofErr w:type="spellEnd"/>
       <w:r>
-        <w:t xml:space="preserve">, </w:t>
-      </w:r>
-      <w:r>
-        <w:t>J.</w:t>
-      </w:r>
-      <w:r>
-        <w:t xml:space="preserve">, </w:t>
-      </w:r>
-      <w:r>
-        <w:rPr>
-          <w:b/>
-          <w:bCs/>
-        </w:rPr>
-        <w:t>Wasserstein</w:t>
-      </w:r>
-      <w:r>
-        <w:rPr>
-          <w:b/>
-          <w:bCs/>
-        </w:rPr>
-        <w:t>,</w:t>
-      </w:r>
-      <w:r>
-        <w:rPr>
-          <w:b/>
-          <w:bCs/>
-        </w:rPr>
-        <w:t xml:space="preserve"> M. L.</w:t>
-      </w:r>
-      <w:r>
-        <w:t xml:space="preserve">, </w:t>
-      </w:r>
-      <w:proofErr w:type="spellStart"/>
-      <w:r>
-        <w:t>Veals</w:t>
-      </w:r>
-      <w:proofErr w:type="spellEnd"/>
-      <w:r>
-        <w:t>, P. G.</w:t>
-      </w:r>
-      <w:r>
-        <w:t xml:space="preserve">, </w:t>
-      </w:r>
-      <w:r>
-        <w:t>Evans, A.</w:t>
-      </w:r>
-      <w:r>
-        <w:t xml:space="preserve">, and </w:t>
-      </w:r>
-      <w:r>
-        <w:t>Kingsmill,</w:t>
-      </w:r>
-      <w:r>
-        <w:t xml:space="preserve"> </w:t>
-      </w:r>
-      <w:r>
-        <w:t>D</w:t>
-      </w:r>
-      <w:r>
-        <w:t>. 2025. "</w:t>
-      </w:r>
-      <w:r>
-        <w:t>Alta Atwater</w:t>
-      </w:r>
-      <w:r>
-        <w:t xml:space="preserve"> PARSIVEL </w:t>
-      </w:r>
-      <w:proofErr w:type="spellStart"/>
-      <w:r>
-        <w:t>Disdrometer</w:t>
-      </w:r>
-      <w:proofErr w:type="spellEnd"/>
-      <w:r>
         <w:t xml:space="preserve"> Measurements 2022-2024." The Hive: University of Utah Research Data Repository. </w:t>
       </w:r>
-      <w:hyperlink r:id="rId9" w:history="1">
+      <w:hyperlink r:id="rId11" w:history="1">
         <w:r>
           <w:rPr>
             <w:rStyle w:val="Hyperlink"/>
@@ -3187,7 +3385,6 @@
     <w:p>
       <w:pPr>
         <w:pStyle w:val="BodyText"/>
-        <w:spacing w:before="92"/>
         <w:ind w:left="119" w:right="116" w:hanging="1"/>
         <w:rPr>
           <w:b/>
@@ -3199,85 +3396,68 @@
     <w:p>
       <w:pPr>
         <w:pStyle w:val="BodyText"/>
-        <w:spacing w:before="92"/>
         <w:ind w:left="119" w:right="116" w:hanging="1"/>
       </w:pPr>
+      <w:r>
+        <w:t xml:space="preserve">Steenburgh, </w:t>
+      </w:r>
+      <w:r>
+        <w:t>J.</w:t>
+      </w:r>
+      <w:r>
+        <w:t xml:space="preserve">, </w:t>
+      </w:r>
+      <w:r>
+        <w:rPr>
+          <w:b/>
+          <w:bCs/>
+        </w:rPr>
+        <w:t>Wasserstein</w:t>
+      </w:r>
+      <w:r>
+        <w:rPr>
+          <w:b/>
+          <w:bCs/>
+        </w:rPr>
+        <w:t>,</w:t>
+      </w:r>
+      <w:r>
+        <w:rPr>
+          <w:b/>
+          <w:bCs/>
+        </w:rPr>
+        <w:t xml:space="preserve"> M. L.</w:t>
+      </w:r>
+      <w:r>
+        <w:t xml:space="preserve">, </w:t>
+      </w:r>
+      <w:r>
+        <w:t>Veals, P. G.</w:t>
+      </w:r>
+      <w:r>
+        <w:t xml:space="preserve">, </w:t>
+      </w:r>
+      <w:r>
+        <w:t>Evans, A.</w:t>
+      </w:r>
+      <w:r>
+        <w:t xml:space="preserve">, and </w:t>
+      </w:r>
+      <w:r>
+        <w:t>Kingsmill, D.E.</w:t>
+      </w:r>
+      <w:r>
+        <w:t xml:space="preserve"> 2025. "Highland PARSIVEL </w:t>
+      </w:r>
       <w:proofErr w:type="spellStart"/>
       <w:r>
-        <w:t>Steenburgh</w:t>
+        <w:t>Disdrometer</w:t>
       </w:r>
       <w:proofErr w:type="spellEnd"/>
       <w:r>
-        <w:t xml:space="preserve">, </w:t>
-      </w:r>
-      <w:r>
-        <w:t>J.</w:t>
-      </w:r>
-      <w:r>
-        <w:t xml:space="preserve">, </w:t>
-      </w:r>
-      <w:r>
-        <w:rPr>
-          <w:b/>
-          <w:bCs/>
-        </w:rPr>
-        <w:t>Wasserstein</w:t>
-      </w:r>
-      <w:r>
-        <w:rPr>
-          <w:b/>
-          <w:bCs/>
-        </w:rPr>
-        <w:t>,</w:t>
-      </w:r>
-      <w:r>
-        <w:rPr>
-          <w:b/>
-          <w:bCs/>
-        </w:rPr>
-        <w:t xml:space="preserve"> M. L.</w:t>
-      </w:r>
-      <w:r>
-        <w:t xml:space="preserve">, </w:t>
-      </w:r>
-      <w:proofErr w:type="spellStart"/>
-      <w:r>
-        <w:t>Veals</w:t>
-      </w:r>
-      <w:proofErr w:type="spellEnd"/>
-      <w:r>
-        <w:t>, P. G.</w:t>
-      </w:r>
-      <w:r>
-        <w:t xml:space="preserve">, </w:t>
-      </w:r>
-      <w:r>
-        <w:t>Evans, A.</w:t>
-      </w:r>
-      <w:r>
-        <w:t xml:space="preserve">, and </w:t>
-      </w:r>
-      <w:r>
-        <w:t>Kingsmill,</w:t>
-      </w:r>
-      <w:r>
-        <w:t xml:space="preserve"> </w:t>
-      </w:r>
-      <w:r>
-        <w:t>D</w:t>
-      </w:r>
-      <w:r>
-        <w:t xml:space="preserve">. 2025. "Highland PARSIVEL </w:t>
-      </w:r>
-      <w:proofErr w:type="spellStart"/>
-      <w:r>
-        <w:t>Disdrometer</w:t>
-      </w:r>
-      <w:proofErr w:type="spellEnd"/>
-      <w:r>
         <w:t xml:space="preserve"> Measurements 2022-2024." The Hive: University of Utah Research Data Repository. </w:t>
       </w:r>
-      <w:hyperlink r:id="rId10" w:history="1">
+      <w:hyperlink r:id="rId12" w:history="1">
         <w:r>
           <w:rPr>
             <w:rStyle w:val="Hyperlink"/>
@@ -3292,7 +3472,6 @@
     <w:p>
       <w:pPr>
         <w:pStyle w:val="BodyText"/>
-        <w:spacing w:before="92"/>
         <w:ind w:right="116"/>
         <w:rPr>
           <w:b/>
@@ -3304,19 +3483,14 @@
     <w:p>
       <w:pPr>
         <w:pStyle w:val="BodyText"/>
-        <w:spacing w:before="92"/>
         <w:ind w:left="119" w:right="116" w:hanging="1"/>
         <w:rPr>
           <w:color w:val="000000" w:themeColor="text1"/>
         </w:rPr>
       </w:pPr>
-      <w:proofErr w:type="spellStart"/>
-      <w:r>
-        <w:t>Steenburgh</w:t>
-      </w:r>
-      <w:proofErr w:type="spellEnd"/>
-      <w:r>
-        <w:t xml:space="preserve">, J., </w:t>
+      <w:r>
+        <w:lastRenderedPageBreak/>
+        <w:t xml:space="preserve">Steenburgh, J., </w:t>
       </w:r>
       <w:r>
         <w:rPr>
@@ -3356,7 +3530,7 @@
         </w:rPr>
         <w:t xml:space="preserve"> </w:t>
       </w:r>
-      <w:hyperlink r:id="rId11" w:history="1">
+      <w:hyperlink r:id="rId13" w:history="1">
         <w:r>
           <w:rPr>
             <w:rStyle w:val="Hyperlink"/>
@@ -3375,7 +3549,6 @@
     <w:p>
       <w:pPr>
         <w:pStyle w:val="BodyText"/>
-        <w:spacing w:before="92"/>
         <w:ind w:left="119" w:right="116" w:hanging="1"/>
         <w:rPr>
           <w:b/>
@@ -3387,7 +3560,6 @@
     <w:p>
       <w:pPr>
         <w:pStyle w:val="BodyText"/>
-        <w:spacing w:before="92"/>
         <w:ind w:left="119" w:right="116" w:hanging="1"/>
       </w:pPr>
       <w:r>
@@ -3401,15 +3573,7 @@
         <w:t xml:space="preserve"> and</w:t>
       </w:r>
       <w:r>
-        <w:t xml:space="preserve"> </w:t>
-      </w:r>
-      <w:proofErr w:type="spellStart"/>
-      <w:r>
-        <w:t>Steenburgh</w:t>
-      </w:r>
-      <w:proofErr w:type="spellEnd"/>
-      <w:r>
-        <w:t>, W.J.,</w:t>
+        <w:t xml:space="preserve"> Steenburgh, W.J.,</w:t>
       </w:r>
       <w:r>
         <w:t xml:space="preserve"> 2023.</w:t>
@@ -3423,7 +3587,7 @@
         </w:rPr>
         <w:t xml:space="preserve">Alta-Collins Snow and Liquid Precipitation Equivalent Observations 2000–2023." The Hive: University of Utah Research Data Repository, </w:t>
       </w:r>
-      <w:hyperlink r:id="rId12" w:history="1">
+      <w:hyperlink r:id="rId14" w:history="1">
         <w:r>
           <w:rPr>
             <w:rStyle w:val="Hyperlink"/>
@@ -3442,7 +3606,6 @@
     <w:p>
       <w:pPr>
         <w:pStyle w:val="BodyText"/>
-        <w:spacing w:before="92"/>
         <w:ind w:left="119" w:right="116" w:hanging="1"/>
       </w:pPr>
     </w:p>
@@ -3462,6 +3625,10 @@
     <w:p>
       <w:pPr>
         <w:pStyle w:val="Heading1"/>
+        <w:numPr>
+          <w:ilvl w:val="0"/>
+          <w:numId w:val="13"/>
+        </w:numPr>
         <w:rPr>
           <w:b w:val="0"/>
           <w:bCs w:val="0"/>
@@ -3474,32 +3641,37 @@
           <w:bCs w:val="0"/>
           <w:u w:val="none"/>
         </w:rPr>
-        <w:t>S</w:t>
+        <w:t>Seeded and Natural Orographic Winter Storms and Catchment Processes Evaluation</w:t>
       </w:r>
       <w:r>
         <w:rPr>
           <w:b w:val="0"/>
           <w:bCs w:val="0"/>
           <w:u w:val="none"/>
-          <w:vertAlign w:val="superscript"/>
-        </w:rPr>
-        <w:t>2</w:t>
-      </w:r>
-      <w:r>
+        </w:rPr>
+        <w:t xml:space="preserve"> (SNOWSCAPE), Northern Utah, Winter 2025/26</w:t>
+      </w:r>
+    </w:p>
+    <w:p>
+      <w:pPr>
+        <w:pStyle w:val="Heading1"/>
+        <w:numPr>
+          <w:ilvl w:val="0"/>
+          <w:numId w:val="13"/>
+        </w:numPr>
         <w:rPr>
           <w:b w:val="0"/>
           <w:bCs w:val="0"/>
           <w:u w:val="none"/>
         </w:rPr>
-        <w:t>noCliME Field Campaign, Steamboat Springs, CO</w:t>
-      </w:r>
+      </w:pPr>
       <w:r>
         <w:rPr>
           <w:b w:val="0"/>
           <w:bCs w:val="0"/>
           <w:u w:val="none"/>
         </w:rPr>
-        <w:t>, January 2025</w:t>
+        <w:t xml:space="preserve">Snow Sensitivity to Clouds in a Mountain Environment </w:t>
       </w:r>
       <w:r>
         <w:rPr>
@@ -3507,13 +3679,69 @@
           <w:bCs w:val="0"/>
           <w:u w:val="none"/>
         </w:rPr>
+        <w:t>(</w:t>
+      </w:r>
+      <w:r>
+        <w:rPr>
+          <w:b w:val="0"/>
+          <w:bCs w:val="0"/>
+          <w:u w:val="none"/>
+        </w:rPr>
+        <w:t>S</w:t>
+      </w:r>
+      <w:r>
+        <w:rPr>
+          <w:b w:val="0"/>
+          <w:bCs w:val="0"/>
+          <w:u w:val="none"/>
+          <w:vertAlign w:val="superscript"/>
+        </w:rPr>
+        <w:t>2</w:t>
+      </w:r>
+      <w:r>
+        <w:rPr>
+          <w:b w:val="0"/>
+          <w:bCs w:val="0"/>
+          <w:u w:val="none"/>
+        </w:rPr>
+        <w:t>noCliME</w:t>
+      </w:r>
+      <w:r>
+        <w:rPr>
+          <w:b w:val="0"/>
+          <w:bCs w:val="0"/>
+          <w:u w:val="none"/>
+        </w:rPr>
+        <w:t>)</w:t>
+      </w:r>
+      <w:r>
+        <w:rPr>
+          <w:b w:val="0"/>
+          <w:bCs w:val="0"/>
+          <w:u w:val="none"/>
+        </w:rPr>
+        <w:t>, Steamboat Springs, CO</w:t>
+      </w:r>
+      <w:r>
+        <w:rPr>
+          <w:b w:val="0"/>
+          <w:bCs w:val="0"/>
+          <w:u w:val="none"/>
+        </w:rPr>
+        <w:t>, January 2025</w:t>
+      </w:r>
+      <w:r>
+        <w:rPr>
+          <w:b w:val="0"/>
+          <w:bCs w:val="0"/>
+          <w:u w:val="none"/>
+        </w:rPr>
         <w:t>.</w:t>
       </w:r>
     </w:p>
     <w:p>
       <w:pPr>
         <w:pStyle w:val="BodyText"/>
-        <w:spacing w:before="2"/>
       </w:pPr>
     </w:p>
     <w:p>
@@ -3545,7 +3773,6 @@
           <w:tab w:val="left" w:pos="839"/>
           <w:tab w:val="left" w:pos="840"/>
         </w:tabs>
-        <w:spacing w:line="254" w:lineRule="auto"/>
         <w:ind w:right="124"/>
       </w:pPr>
     </w:p>
@@ -3560,7 +3787,6 @@
           <w:tab w:val="left" w:pos="839"/>
           <w:tab w:val="left" w:pos="840"/>
         </w:tabs>
-        <w:spacing w:line="254" w:lineRule="auto"/>
         <w:ind w:right="124"/>
       </w:pPr>
       <w:r>
@@ -3606,7 +3832,6 @@
           <w:tab w:val="left" w:pos="839"/>
           <w:tab w:val="left" w:pos="840"/>
         </w:tabs>
-        <w:spacing w:line="254" w:lineRule="auto"/>
         <w:ind w:right="124"/>
       </w:pPr>
       <w:r>
@@ -3617,7 +3842,16 @@
         <w:t>Models</w:t>
       </w:r>
       <w:r>
-        <w:t>: WRF, CM1</w:t>
+        <w:t xml:space="preserve">: </w:t>
+      </w:r>
+      <w:r>
+        <w:t>Weather Research and Forecasting (WRF)</w:t>
+      </w:r>
+      <w:r>
+        <w:t xml:space="preserve">, </w:t>
+      </w:r>
+      <w:r>
+        <w:t>Cloud Model 1 (CM1)</w:t>
       </w:r>
     </w:p>
     <w:p>
@@ -3631,7 +3865,6 @@
           <w:tab w:val="left" w:pos="839"/>
           <w:tab w:val="left" w:pos="840"/>
         </w:tabs>
-        <w:spacing w:line="254" w:lineRule="auto"/>
         <w:ind w:right="124"/>
       </w:pPr>
       <w:r>
@@ -3639,44 +3872,28 @@
           <w:b/>
           <w:bCs/>
         </w:rPr>
-        <w:t>Languages</w:t>
-      </w:r>
-      <w:r>
-        <w:t>: English (primary), Spanish</w:t>
-      </w:r>
-    </w:p>
-    <w:p>
-      <w:pPr>
-        <w:pStyle w:val="BodyText"/>
-        <w:spacing w:before="2"/>
-        <w:rPr>
-          <w:sz w:val="21"/>
-        </w:rPr>
-      </w:pPr>
-    </w:p>
-    <w:p>
-      <w:pPr>
-        <w:pStyle w:val="Heading1"/>
-        <w:spacing w:before="1"/>
-        <w:rPr>
-          <w:u w:val="none"/>
-        </w:rPr>
-      </w:pPr>
-      <w:r>
-        <w:rPr>
-          <w:spacing w:val="-2"/>
-        </w:rPr>
-        <w:t>AFFILIATIONS</w:t>
-      </w:r>
-    </w:p>
-    <w:p>
-      <w:pPr>
-        <w:pStyle w:val="BodyText"/>
-        <w:spacing w:before="11"/>
-        <w:rPr>
-          <w:b/>
-        </w:rPr>
-      </w:pPr>
+        <w:t>Tools</w:t>
+      </w:r>
+      <w:r>
+        <w:t>:</w:t>
+      </w:r>
+      <w:r>
+        <w:t xml:space="preserve"> </w:t>
+      </w:r>
+      <w:r>
+        <w:t xml:space="preserve">Cloud resolving model radar simulator (CR-SIM), </w:t>
+      </w:r>
+      <w:proofErr w:type="spellStart"/>
+      <w:r>
+        <w:t>Lagrangian</w:t>
+      </w:r>
+      <w:proofErr w:type="spellEnd"/>
+      <w:r>
+        <w:t xml:space="preserve"> analysis tool</w:t>
+      </w:r>
+      <w:r>
+        <w:t xml:space="preserve"> (LAGRANTO)</w:t>
+      </w:r>
     </w:p>
     <w:p>
       <w:pPr>
@@ -3689,95 +3906,41 @@
           <w:tab w:val="left" w:pos="839"/>
           <w:tab w:val="left" w:pos="840"/>
         </w:tabs>
-      </w:pPr>
-      <w:r>
-        <w:t>Member,</w:t>
-      </w:r>
-      <w:r>
-        <w:rPr>
-          <w:spacing w:val="-7"/>
-        </w:rPr>
-        <w:t xml:space="preserve"> </w:t>
-      </w:r>
-      <w:r>
-        <w:t>American</w:t>
-      </w:r>
-      <w:r>
-        <w:rPr>
-          <w:spacing w:val="-7"/>
-        </w:rPr>
-        <w:t xml:space="preserve"> </w:t>
-      </w:r>
-      <w:r>
-        <w:t>Meteorological</w:t>
-      </w:r>
-      <w:r>
-        <w:rPr>
-          <w:spacing w:val="-3"/>
-        </w:rPr>
-        <w:t xml:space="preserve"> </w:t>
-      </w:r>
-      <w:r>
-        <w:t>Society,</w:t>
-      </w:r>
-      <w:r>
-        <w:rPr>
-          <w:spacing w:val="-4"/>
-        </w:rPr>
-        <w:t xml:space="preserve"> </w:t>
-      </w:r>
-      <w:r>
-        <w:t>2018</w:t>
-      </w:r>
-      <w:r>
-        <w:rPr>
-          <w:spacing w:val="-4"/>
-        </w:rPr>
-        <w:t xml:space="preserve"> </w:t>
-      </w:r>
-      <w:r>
-        <w:t>to</w:t>
-      </w:r>
-      <w:r>
-        <w:rPr>
-          <w:spacing w:val="-7"/>
-        </w:rPr>
-        <w:t xml:space="preserve"> </w:t>
-      </w:r>
+        <w:ind w:right="124"/>
+      </w:pPr>
+      <w:r>
+        <w:rPr>
+          <w:b/>
+          <w:bCs/>
+        </w:rPr>
+        <w:t>Languages</w:t>
+      </w:r>
+      <w:r>
+        <w:t>: English (primary), Spanish</w:t>
+      </w:r>
+    </w:p>
+    <w:p>
+      <w:pPr>
+        <w:pStyle w:val="BodyText"/>
+      </w:pPr>
+    </w:p>
+    <w:p>
+      <w:pPr>
+        <w:pStyle w:val="Heading1"/>
+        <w:rPr>
+          <w:u w:val="none"/>
+        </w:rPr>
+      </w:pPr>
       <w:r>
         <w:rPr>
           <w:spacing w:val="-2"/>
         </w:rPr>
-        <w:t>present</w:t>
-      </w:r>
-    </w:p>
-    <w:p>
-      <w:pPr>
-        <w:tabs>
-          <w:tab w:val="left" w:pos="839"/>
-          <w:tab w:val="left" w:pos="840"/>
-        </w:tabs>
-      </w:pPr>
-    </w:p>
-    <w:p>
-      <w:pPr>
-        <w:pStyle w:val="Heading1"/>
-        <w:spacing w:before="1"/>
-        <w:rPr>
-          <w:u w:val="none"/>
-        </w:rPr>
-      </w:pPr>
-      <w:r>
-        <w:rPr>
-          <w:spacing w:val="-2"/>
-        </w:rPr>
-        <w:t>SERVICE</w:t>
+        <w:t>AFFILIATIONS</w:t>
       </w:r>
     </w:p>
     <w:p>
       <w:pPr>
         <w:pStyle w:val="BodyText"/>
-        <w:spacing w:before="11"/>
         <w:rPr>
           <w:b/>
         </w:rPr>
@@ -3796,8 +3959,95 @@
         </w:tabs>
       </w:pPr>
       <w:r>
-        <w:t>First-year Graduate Student Mentor, University of Utah, 2024 to present</w:t>
-      </w:r>
+        <w:t>Member,</w:t>
+      </w:r>
+      <w:r>
+        <w:rPr>
+          <w:spacing w:val="-7"/>
+        </w:rPr>
+        <w:t xml:space="preserve"> </w:t>
+      </w:r>
+      <w:r>
+        <w:t>American</w:t>
+      </w:r>
+      <w:r>
+        <w:rPr>
+          <w:spacing w:val="-7"/>
+        </w:rPr>
+        <w:t xml:space="preserve"> </w:t>
+      </w:r>
+      <w:r>
+        <w:t>Meteorological</w:t>
+      </w:r>
+      <w:r>
+        <w:rPr>
+          <w:spacing w:val="-3"/>
+        </w:rPr>
+        <w:t xml:space="preserve"> </w:t>
+      </w:r>
+      <w:r>
+        <w:t>Society,</w:t>
+      </w:r>
+      <w:r>
+        <w:rPr>
+          <w:spacing w:val="-4"/>
+        </w:rPr>
+        <w:t xml:space="preserve"> </w:t>
+      </w:r>
+      <w:r>
+        <w:t>2018</w:t>
+      </w:r>
+      <w:r>
+        <w:rPr>
+          <w:spacing w:val="-4"/>
+        </w:rPr>
+        <w:t xml:space="preserve"> </w:t>
+      </w:r>
+      <w:r>
+        <w:t>to</w:t>
+      </w:r>
+      <w:r>
+        <w:rPr>
+          <w:spacing w:val="-7"/>
+        </w:rPr>
+        <w:t xml:space="preserve"> </w:t>
+      </w:r>
+      <w:r>
+        <w:rPr>
+          <w:spacing w:val="-2"/>
+        </w:rPr>
+        <w:t>present</w:t>
+      </w:r>
+    </w:p>
+    <w:p>
+      <w:pPr>
+        <w:tabs>
+          <w:tab w:val="left" w:pos="839"/>
+          <w:tab w:val="left" w:pos="840"/>
+        </w:tabs>
+      </w:pPr>
+    </w:p>
+    <w:p>
+      <w:pPr>
+        <w:pStyle w:val="Heading1"/>
+        <w:rPr>
+          <w:u w:val="none"/>
+        </w:rPr>
+      </w:pPr>
+      <w:r>
+        <w:rPr>
+          <w:spacing w:val="-2"/>
+        </w:rPr>
+        <w:t>SERVICE</w:t>
+      </w:r>
+    </w:p>
+    <w:p>
+      <w:pPr>
+        <w:pStyle w:val="BodyText"/>
+        <w:rPr>
+          <w:b/>
+        </w:rPr>
+      </w:pPr>
     </w:p>
     <w:p>
       <w:pPr>
@@ -3812,99 +4062,8 @@
         </w:tabs>
       </w:pPr>
       <w:r>
-        <w:t>Student Member,</w:t>
-      </w:r>
-      <w:r>
-        <w:rPr>
-          <w:spacing w:val="-7"/>
-        </w:rPr>
-        <w:t xml:space="preserve"> </w:t>
-      </w:r>
-      <w:r>
-        <w:t>American</w:t>
-      </w:r>
-      <w:r>
-        <w:rPr>
-          <w:spacing w:val="-7"/>
-        </w:rPr>
-        <w:t xml:space="preserve"> </w:t>
-      </w:r>
-      <w:r>
-        <w:t>Meteorological</w:t>
-      </w:r>
-      <w:r>
-        <w:rPr>
-          <w:spacing w:val="-3"/>
-        </w:rPr>
-        <w:t xml:space="preserve"> </w:t>
-      </w:r>
-      <w:r>
-        <w:t>Society Committee on Mountain Meteorology,</w:t>
-      </w:r>
-      <w:r>
-        <w:rPr>
-          <w:spacing w:val="-4"/>
-        </w:rPr>
-        <w:t xml:space="preserve"> </w:t>
-      </w:r>
-      <w:r>
-        <w:t>2024</w:t>
-      </w:r>
-      <w:r>
-        <w:rPr>
-          <w:spacing w:val="-4"/>
-        </w:rPr>
-        <w:t xml:space="preserve"> </w:t>
-      </w:r>
-      <w:r>
-        <w:t>to</w:t>
-      </w:r>
-      <w:r>
-        <w:rPr>
-          <w:spacing w:val="-7"/>
-        </w:rPr>
-        <w:t xml:space="preserve"> </w:t>
-      </w:r>
-      <w:r>
-        <w:rPr>
-          <w:spacing w:val="-2"/>
-        </w:rPr>
-        <w:t>present</w:t>
-      </w:r>
-    </w:p>
-    <w:p>
-      <w:pPr>
-        <w:pStyle w:val="Heading1"/>
-        <w:spacing w:before="1"/>
-        <w:ind w:left="0"/>
-        <w:rPr>
-          <w:spacing w:val="-2"/>
-        </w:rPr>
-      </w:pPr>
-    </w:p>
-    <w:p>
-      <w:pPr>
-        <w:pStyle w:val="Heading1"/>
-        <w:spacing w:before="1"/>
-        <w:rPr>
-          <w:u w:val="none"/>
-        </w:rPr>
-      </w:pPr>
-      <w:r>
-        <w:rPr>
-          <w:spacing w:val="-2"/>
-        </w:rPr>
-        <w:t>PRESS</w:t>
-      </w:r>
-    </w:p>
-    <w:p>
-      <w:pPr>
-        <w:pStyle w:val="BodyText"/>
-        <w:spacing w:before="11"/>
-        <w:rPr>
-          <w:b/>
-        </w:rPr>
-      </w:pPr>
+        <w:t>First-year Graduate Student Mentor, University of Utah, 2024 to present</w:t>
+      </w:r>
     </w:p>
     <w:p>
       <w:pPr>
@@ -3917,6 +4076,233 @@
           <w:tab w:val="left" w:pos="839"/>
           <w:tab w:val="left" w:pos="840"/>
         </w:tabs>
+      </w:pPr>
+      <w:r>
+        <w:t>Student Member,</w:t>
+      </w:r>
+      <w:r>
+        <w:rPr>
+          <w:spacing w:val="-7"/>
+        </w:rPr>
+        <w:t xml:space="preserve"> </w:t>
+      </w:r>
+      <w:r>
+        <w:t>American</w:t>
+      </w:r>
+      <w:r>
+        <w:rPr>
+          <w:spacing w:val="-7"/>
+        </w:rPr>
+        <w:t xml:space="preserve"> </w:t>
+      </w:r>
+      <w:r>
+        <w:t>Meteorological</w:t>
+      </w:r>
+      <w:r>
+        <w:rPr>
+          <w:spacing w:val="-3"/>
+        </w:rPr>
+        <w:t xml:space="preserve"> </w:t>
+      </w:r>
+      <w:r>
+        <w:t>Society Committee on Mountain Meteorology,</w:t>
+      </w:r>
+      <w:r>
+        <w:rPr>
+          <w:spacing w:val="-4"/>
+        </w:rPr>
+        <w:t xml:space="preserve"> </w:t>
+      </w:r>
+      <w:r>
+        <w:t>2024</w:t>
+      </w:r>
+      <w:r>
+        <w:rPr>
+          <w:spacing w:val="-4"/>
+        </w:rPr>
+        <w:t xml:space="preserve"> </w:t>
+      </w:r>
+      <w:r>
+        <w:t>to</w:t>
+      </w:r>
+      <w:r>
+        <w:rPr>
+          <w:spacing w:val="-7"/>
+        </w:rPr>
+        <w:t xml:space="preserve"> </w:t>
+      </w:r>
+      <w:r>
+        <w:rPr>
+          <w:spacing w:val="-2"/>
+        </w:rPr>
+        <w:t>present</w:t>
+      </w:r>
+    </w:p>
+    <w:p>
+      <w:pPr>
+        <w:pStyle w:val="ListParagraph"/>
+        <w:numPr>
+          <w:ilvl w:val="0"/>
+          <w:numId w:val="5"/>
+        </w:numPr>
+        <w:tabs>
+          <w:tab w:val="left" w:pos="839"/>
+          <w:tab w:val="left" w:pos="840"/>
+        </w:tabs>
+      </w:pPr>
+      <w:r>
+        <w:rPr>
+          <w:spacing w:val="-2"/>
+        </w:rPr>
+        <w:t xml:space="preserve">Mentor, </w:t>
+      </w:r>
+      <w:r>
+        <w:rPr>
+          <w:spacing w:val="-2"/>
+        </w:rPr>
+        <w:t>Research Experience in Alpine Meteorology</w:t>
+      </w:r>
+      <w:r>
+        <w:rPr>
+          <w:spacing w:val="-2"/>
+        </w:rPr>
+        <w:t xml:space="preserve"> REU, University of Utah, summer 2022</w:t>
+      </w:r>
+    </w:p>
+    <w:p>
+      <w:pPr>
+        <w:tabs>
+          <w:tab w:val="left" w:pos="839"/>
+          <w:tab w:val="left" w:pos="840"/>
+        </w:tabs>
+      </w:pPr>
+    </w:p>
+    <w:p>
+      <w:pPr>
+        <w:pStyle w:val="Heading1"/>
+        <w:rPr>
+          <w:u w:val="none"/>
+        </w:rPr>
+      </w:pPr>
+      <w:r>
+        <w:rPr>
+          <w:spacing w:val="-2"/>
+        </w:rPr>
+        <w:t>REVIEWS</w:t>
+      </w:r>
+    </w:p>
+    <w:p>
+      <w:pPr>
+        <w:tabs>
+          <w:tab w:val="left" w:pos="839"/>
+          <w:tab w:val="left" w:pos="840"/>
+        </w:tabs>
+      </w:pPr>
+      <w:r>
+        <w:tab/>
+      </w:r>
+    </w:p>
+    <w:p>
+      <w:pPr>
+        <w:tabs>
+          <w:tab w:val="left" w:pos="839"/>
+          <w:tab w:val="left" w:pos="840"/>
+        </w:tabs>
+        <w:rPr>
+          <w:i/>
+          <w:iCs/>
+        </w:rPr>
+      </w:pPr>
+      <w:r>
+        <w:t xml:space="preserve">             </w:t>
+      </w:r>
+      <w:r>
+        <w:rPr>
+          <w:b/>
+          <w:bCs/>
+        </w:rPr>
+        <w:t xml:space="preserve">Total Reviews </w:t>
+      </w:r>
+      <w:r>
+        <w:rPr>
+          <w:i/>
+          <w:iCs/>
+        </w:rPr>
+        <w:t>Journal Name (Publisher)</w:t>
+      </w:r>
+    </w:p>
+    <w:p>
+      <w:pPr>
+        <w:pStyle w:val="ListParagraph"/>
+        <w:numPr>
+          <w:ilvl w:val="0"/>
+          <w:numId w:val="14"/>
+        </w:numPr>
+        <w:tabs>
+          <w:tab w:val="left" w:pos="839"/>
+          <w:tab w:val="left" w:pos="840"/>
+        </w:tabs>
+      </w:pPr>
+      <w:r>
+        <w:rPr>
+          <w:b/>
+          <w:bCs/>
+        </w:rPr>
+        <w:t xml:space="preserve">1 </w:t>
+      </w:r>
+      <w:r>
+        <w:rPr>
+          <w:i/>
+          <w:iCs/>
+        </w:rPr>
+        <w:t>Monthly Weather Review (AMS)</w:t>
+      </w:r>
+      <w:r>
+        <w:t xml:space="preserve"> </w:t>
+      </w:r>
+    </w:p>
+    <w:p>
+      <w:pPr>
+        <w:pStyle w:val="Heading1"/>
+        <w:ind w:left="0"/>
+        <w:rPr>
+          <w:spacing w:val="-2"/>
+        </w:rPr>
+      </w:pPr>
+    </w:p>
+    <w:p>
+      <w:pPr>
+        <w:pStyle w:val="Heading1"/>
+        <w:rPr>
+          <w:u w:val="none"/>
+        </w:rPr>
+      </w:pPr>
+      <w:r>
+        <w:rPr>
+          <w:spacing w:val="-2"/>
+        </w:rPr>
+        <w:t>PRESS</w:t>
+      </w:r>
+    </w:p>
+    <w:p>
+      <w:pPr>
+        <w:pStyle w:val="BodyText"/>
+        <w:rPr>
+          <w:b/>
+        </w:rPr>
+      </w:pPr>
+    </w:p>
+    <w:p>
+      <w:pPr>
+        <w:pStyle w:val="ListParagraph"/>
+        <w:numPr>
+          <w:ilvl w:val="0"/>
+          <w:numId w:val="5"/>
+        </w:numPr>
+        <w:tabs>
+          <w:tab w:val="left" w:pos="839"/>
+          <w:tab w:val="left" w:pos="840"/>
+        </w:tabs>
         <w:rPr>
           <w:sz w:val="24"/>
           <w:szCs w:val="24"/>
@@ -3929,7 +4315,7 @@
         </w:rPr>
         <w:t xml:space="preserve">KUER  (02/21/2024) “It’s been a warm, wet winter in Utah but don’t blame El Niño”: </w:t>
       </w:r>
-      <w:hyperlink r:id="rId13" w:history="1">
+      <w:hyperlink r:id="rId15" w:history="1">
         <w:r>
           <w:rPr>
             <w:rStyle w:val="Hyperlink"/>
@@ -3963,7 +4349,7 @@
         </w:rPr>
         <w:t xml:space="preserve">@THEU (02/05/2024) “Where does the central Wasatch’s extreme snowfall come from?”: </w:t>
       </w:r>
-      <w:hyperlink r:id="rId14" w:history="1">
+      <w:hyperlink r:id="rId16" w:history="1">
         <w:r>
           <w:rPr>
             <w:rStyle w:val="Hyperlink"/>
@@ -3983,12 +4369,116 @@
       </w:pPr>
     </w:p>
     <w:sectPr>
+      <w:headerReference w:type="even" r:id="rId17"/>
+      <w:headerReference w:type="default" r:id="rId18"/>
+      <w:footerReference w:type="even" r:id="rId19"/>
+      <w:footerReference w:type="default" r:id="rId20"/>
+      <w:headerReference w:type="first" r:id="rId21"/>
+      <w:footerReference w:type="first" r:id="rId22"/>
       <w:pgSz w:w="12240" w:h="15840"/>
       <w:pgMar w:top="560" w:right="520" w:bottom="280" w:left="500" w:header="720" w:footer="720" w:gutter="0"/>
       <w:cols w:space="720"/>
     </w:sectPr>
   </w:body>
 </w:document>
+</file>
+
+<file path=word/endnotes.xml><?xml version="1.0" encoding="utf-8"?>
+<w:endnotes xmlns:wpc="http://schemas.microsoft.com/office/word/2010/wordprocessingCanvas" xmlns:cx="http://schemas.microsoft.com/office/drawing/2014/chartex" xmlns:cx1="http://schemas.microsoft.com/office/drawing/2015/9/8/chartex" xmlns:cx2="http://schemas.microsoft.com/office/drawing/2015/10/21/chartex" xmlns:cx3="http://schemas.microsoft.com/office/drawing/2016/5/9/chartex" xmlns:cx4="http://schemas.microsoft.com/office/drawing/2016/5/10/chartex" xmlns:cx5="http://schemas.microsoft.com/office/drawing/2016/5/11/chartex" xmlns:cx6="http://schemas.microsoft.com/office/drawing/2016/5/12/chartex" xmlns:cx7="http://schemas.microsoft.com/office/drawing/2016/5/13/chartex" xmlns:cx8="http://schemas.microsoft.com/office/drawing/2016/5/14/chartex" xmlns:mc="http://schemas.openxmlformats.org/markup-compatibility/2006" xmlns:aink="http://schemas.microsoft.com/office/drawing/2016/ink" xmlns:am3d="http://schemas.microsoft.com/office/drawing/2017/model3d" xmlns:o="urn:schemas-microsoft-com:office:office" xmlns:oel="http://schemas.microsoft.com/office/2019/extlst" xmlns:r="http://schemas.openxmlformats.org/officeDocument/2006/relationships" xmlns:m="http://schemas.openxmlformats.org/officeDocument/2006/math" xmlns:v="urn:schemas-microsoft-com:vml" xmlns:wp14="http://schemas.microsoft.com/office/word/2010/wordprocessingDrawing" xmlns:wp="http://schemas.openxmlformats.org/drawingml/2006/wordprocessingDrawing" xmlns:w10="urn:schemas-microsoft-com:office:word" xmlns:w="http://schemas.openxmlformats.org/wordprocessingml/2006/main" xmlns:w14="http://schemas.microsoft.com/office/word/2010/wordml" xmlns:w15="http://schemas.microsoft.com/office/word/2012/wordml" xmlns:w16cex="http://schemas.microsoft.com/office/word/2018/wordml/cex" xmlns:w16cid="http://schemas.microsoft.com/office/word/2016/wordml/cid" xmlns:w16="http://schemas.microsoft.com/office/word/2018/wordml" xmlns:w16du="http://schemas.microsoft.com/office/word/2023/wordml/word16du" xmlns:w16sdtdh="http://schemas.microsoft.com/office/word/2020/wordml/sdtdatahash" xmlns:w16se="http://schemas.microsoft.com/office/word/2015/wordml/symex" xmlns:wpg="http://schemas.microsoft.com/office/word/2010/wordprocessingGroup" xmlns:wpi="http://schemas.microsoft.com/office/word/2010/wordprocessingInk" xmlns:wne="http://schemas.microsoft.com/office/word/2006/wordml" xmlns:wps="http://schemas.microsoft.com/office/word/2010/wordprocessingShape" mc:Ignorable="w14 w15 w16se w16cid w16 w16cex w16sdtdh w16du wp14">
+  <w:endnote w:type="separator" w:id="-1">
+    <w:p>
+      <w:r>
+        <w:separator/>
+      </w:r>
+    </w:p>
+  </w:endnote>
+  <w:endnote w:type="continuationSeparator" w:id="0">
+    <w:p>
+      <w:r>
+        <w:continuationSeparator/>
+      </w:r>
+    </w:p>
+  </w:endnote>
+</w:endnotes>
+</file>
+
+<file path=word/footer1.xml><?xml version="1.0" encoding="utf-8"?>
+<w:ftr xmlns:wpc="http://schemas.microsoft.com/office/word/2010/wordprocessingCanvas" xmlns:cx="http://schemas.microsoft.com/office/drawing/2014/chartex" xmlns:cx1="http://schemas.microsoft.com/office/drawing/2015/9/8/chartex" xmlns:cx2="http://schemas.microsoft.com/office/drawing/2015/10/21/chartex" xmlns:cx3="http://schemas.microsoft.com/office/drawing/2016/5/9/chartex" xmlns:cx4="http://schemas.microsoft.com/office/drawing/2016/5/10/chartex" xmlns:cx5="http://schemas.microsoft.com/office/drawing/2016/5/11/chartex" xmlns:cx6="http://schemas.microsoft.com/office/drawing/2016/5/12/chartex" xmlns:cx7="http://schemas.microsoft.com/office/drawing/2016/5/13/chartex" xmlns:cx8="http://schemas.microsoft.com/office/drawing/2016/5/14/chartex" xmlns:mc="http://schemas.openxmlformats.org/markup-compatibility/2006" xmlns:aink="http://schemas.microsoft.com/office/drawing/2016/ink" xmlns:am3d="http://schemas.microsoft.com/office/drawing/2017/model3d" xmlns:o="urn:schemas-microsoft-com:office:office" xmlns:oel="http://schemas.microsoft.com/office/2019/extlst" xmlns:r="http://schemas.openxmlformats.org/officeDocument/2006/relationships" xmlns:m="http://schemas.openxmlformats.org/officeDocument/2006/math" xmlns:v="urn:schemas-microsoft-com:vml" xmlns:wp14="http://schemas.microsoft.com/office/word/2010/wordprocessingDrawing" xmlns:wp="http://schemas.openxmlformats.org/drawingml/2006/wordprocessingDrawing" xmlns:w10="urn:schemas-microsoft-com:office:word" xmlns:w="http://schemas.openxmlformats.org/wordprocessingml/2006/main" xmlns:w14="http://schemas.microsoft.com/office/word/2010/wordml" xmlns:w15="http://schemas.microsoft.com/office/word/2012/wordml" xmlns:w16cex="http://schemas.microsoft.com/office/word/2018/wordml/cex" xmlns:w16cid="http://schemas.microsoft.com/office/word/2016/wordml/cid" xmlns:w16="http://schemas.microsoft.com/office/word/2018/wordml" xmlns:w16du="http://schemas.microsoft.com/office/word/2023/wordml/word16du" xmlns:w16sdtdh="http://schemas.microsoft.com/office/word/2020/wordml/sdtdatahash" xmlns:w16se="http://schemas.microsoft.com/office/word/2015/wordml/symex" xmlns:wpg="http://schemas.microsoft.com/office/word/2010/wordprocessingGroup" xmlns:wpi="http://schemas.microsoft.com/office/word/2010/wordprocessingInk" xmlns:wne="http://schemas.microsoft.com/office/word/2006/wordml" xmlns:wps="http://schemas.microsoft.com/office/word/2010/wordprocessingShape" mc:Ignorable="w14 w15 w16se w16cid w16 w16cex w16sdtdh w16du wp14">
+  <w:p>
+    <w:pPr>
+      <w:pStyle w:val="Footer"/>
+    </w:pPr>
+  </w:p>
+</w:ftr>
+</file>
+
+<file path=word/footer2.xml><?xml version="1.0" encoding="utf-8"?>
+<w:ftr xmlns:wpc="http://schemas.microsoft.com/office/word/2010/wordprocessingCanvas" xmlns:cx="http://schemas.microsoft.com/office/drawing/2014/chartex" xmlns:cx1="http://schemas.microsoft.com/office/drawing/2015/9/8/chartex" xmlns:cx2="http://schemas.microsoft.com/office/drawing/2015/10/21/chartex" xmlns:cx3="http://schemas.microsoft.com/office/drawing/2016/5/9/chartex" xmlns:cx4="http://schemas.microsoft.com/office/drawing/2016/5/10/chartex" xmlns:cx5="http://schemas.microsoft.com/office/drawing/2016/5/11/chartex" xmlns:cx6="http://schemas.microsoft.com/office/drawing/2016/5/12/chartex" xmlns:cx7="http://schemas.microsoft.com/office/drawing/2016/5/13/chartex" xmlns:cx8="http://schemas.microsoft.com/office/drawing/2016/5/14/chartex" xmlns:mc="http://schemas.openxmlformats.org/markup-compatibility/2006" xmlns:aink="http://schemas.microsoft.com/office/drawing/2016/ink" xmlns:am3d="http://schemas.microsoft.com/office/drawing/2017/model3d" xmlns:o="urn:schemas-microsoft-com:office:office" xmlns:oel="http://schemas.microsoft.com/office/2019/extlst" xmlns:r="http://schemas.openxmlformats.org/officeDocument/2006/relationships" xmlns:m="http://schemas.openxmlformats.org/officeDocument/2006/math" xmlns:v="urn:schemas-microsoft-com:vml" xmlns:wp14="http://schemas.microsoft.com/office/word/2010/wordprocessingDrawing" xmlns:wp="http://schemas.openxmlformats.org/drawingml/2006/wordprocessingDrawing" xmlns:w10="urn:schemas-microsoft-com:office:word" xmlns:w="http://schemas.openxmlformats.org/wordprocessingml/2006/main" xmlns:w14="http://schemas.microsoft.com/office/word/2010/wordml" xmlns:w15="http://schemas.microsoft.com/office/word/2012/wordml" xmlns:w16cex="http://schemas.microsoft.com/office/word/2018/wordml/cex" xmlns:w16cid="http://schemas.microsoft.com/office/word/2016/wordml/cid" xmlns:w16="http://schemas.microsoft.com/office/word/2018/wordml" xmlns:w16du="http://schemas.microsoft.com/office/word/2023/wordml/word16du" xmlns:w16sdtdh="http://schemas.microsoft.com/office/word/2020/wordml/sdtdatahash" xmlns:w16se="http://schemas.microsoft.com/office/word/2015/wordml/symex" xmlns:wpg="http://schemas.microsoft.com/office/word/2010/wordprocessingGroup" xmlns:wpi="http://schemas.microsoft.com/office/word/2010/wordprocessingInk" xmlns:wne="http://schemas.microsoft.com/office/word/2006/wordml" xmlns:wps="http://schemas.microsoft.com/office/word/2010/wordprocessingShape" mc:Ignorable="w14 w15 w16se w16cid w16 w16cex w16sdtdh w16du wp14">
+  <w:p>
+    <w:pPr>
+      <w:pStyle w:val="Footer"/>
+    </w:pPr>
+  </w:p>
+</w:ftr>
+</file>
+
+<file path=word/footer3.xml><?xml version="1.0" encoding="utf-8"?>
+<w:ftr xmlns:wpc="http://schemas.microsoft.com/office/word/2010/wordprocessingCanvas" xmlns:cx="http://schemas.microsoft.com/office/drawing/2014/chartex" xmlns:cx1="http://schemas.microsoft.com/office/drawing/2015/9/8/chartex" xmlns:cx2="http://schemas.microsoft.com/office/drawing/2015/10/21/chartex" xmlns:cx3="http://schemas.microsoft.com/office/drawing/2016/5/9/chartex" xmlns:cx4="http://schemas.microsoft.com/office/drawing/2016/5/10/chartex" xmlns:cx5="http://schemas.microsoft.com/office/drawing/2016/5/11/chartex" xmlns:cx6="http://schemas.microsoft.com/office/drawing/2016/5/12/chartex" xmlns:cx7="http://schemas.microsoft.com/office/drawing/2016/5/13/chartex" xmlns:cx8="http://schemas.microsoft.com/office/drawing/2016/5/14/chartex" xmlns:mc="http://schemas.openxmlformats.org/markup-compatibility/2006" xmlns:aink="http://schemas.microsoft.com/office/drawing/2016/ink" xmlns:am3d="http://schemas.microsoft.com/office/drawing/2017/model3d" xmlns:o="urn:schemas-microsoft-com:office:office" xmlns:oel="http://schemas.microsoft.com/office/2019/extlst" xmlns:r="http://schemas.openxmlformats.org/officeDocument/2006/relationships" xmlns:m="http://schemas.openxmlformats.org/officeDocument/2006/math" xmlns:v="urn:schemas-microsoft-com:vml" xmlns:wp14="http://schemas.microsoft.com/office/word/2010/wordprocessingDrawing" xmlns:wp="http://schemas.openxmlformats.org/drawingml/2006/wordprocessingDrawing" xmlns:w10="urn:schemas-microsoft-com:office:word" xmlns:w="http://schemas.openxmlformats.org/wordprocessingml/2006/main" xmlns:w14="http://schemas.microsoft.com/office/word/2010/wordml" xmlns:w15="http://schemas.microsoft.com/office/word/2012/wordml" xmlns:w16cex="http://schemas.microsoft.com/office/word/2018/wordml/cex" xmlns:w16cid="http://schemas.microsoft.com/office/word/2016/wordml/cid" xmlns:w16="http://schemas.microsoft.com/office/word/2018/wordml" xmlns:w16du="http://schemas.microsoft.com/office/word/2023/wordml/word16du" xmlns:w16sdtdh="http://schemas.microsoft.com/office/word/2020/wordml/sdtdatahash" xmlns:w16se="http://schemas.microsoft.com/office/word/2015/wordml/symex" xmlns:wpg="http://schemas.microsoft.com/office/word/2010/wordprocessingGroup" xmlns:wpi="http://schemas.microsoft.com/office/word/2010/wordprocessingInk" xmlns:wne="http://schemas.microsoft.com/office/word/2006/wordml" xmlns:wps="http://schemas.microsoft.com/office/word/2010/wordprocessingShape" mc:Ignorable="w14 w15 w16se w16cid w16 w16cex w16sdtdh w16du wp14">
+  <w:p>
+    <w:pPr>
+      <w:pStyle w:val="Footer"/>
+    </w:pPr>
+  </w:p>
+</w:ftr>
+</file>
+
+<file path=word/footnotes.xml><?xml version="1.0" encoding="utf-8"?>
+<w:footnotes xmlns:wpc="http://schemas.microsoft.com/office/word/2010/wordprocessingCanvas" xmlns:cx="http://schemas.microsoft.com/office/drawing/2014/chartex" xmlns:cx1="http://schemas.microsoft.com/office/drawing/2015/9/8/chartex" xmlns:cx2="http://schemas.microsoft.com/office/drawing/2015/10/21/chartex" xmlns:cx3="http://schemas.microsoft.com/office/drawing/2016/5/9/chartex" xmlns:cx4="http://schemas.microsoft.com/office/drawing/2016/5/10/chartex" xmlns:cx5="http://schemas.microsoft.com/office/drawing/2016/5/11/chartex" xmlns:cx6="http://schemas.microsoft.com/office/drawing/2016/5/12/chartex" xmlns:cx7="http://schemas.microsoft.com/office/drawing/2016/5/13/chartex" xmlns:cx8="http://schemas.microsoft.com/office/drawing/2016/5/14/chartex" xmlns:mc="http://schemas.openxmlformats.org/markup-compatibility/2006" xmlns:aink="http://schemas.microsoft.com/office/drawing/2016/ink" xmlns:am3d="http://schemas.microsoft.com/office/drawing/2017/model3d" xmlns:o="urn:schemas-microsoft-com:office:office" xmlns:oel="http://schemas.microsoft.com/office/2019/extlst" xmlns:r="http://schemas.openxmlformats.org/officeDocument/2006/relationships" xmlns:m="http://schemas.openxmlformats.org/officeDocument/2006/math" xmlns:v="urn:schemas-microsoft-com:vml" xmlns:wp14="http://schemas.microsoft.com/office/word/2010/wordprocessingDrawing" xmlns:wp="http://schemas.openxmlformats.org/drawingml/2006/wordprocessingDrawing" xmlns:w10="urn:schemas-microsoft-com:office:word" xmlns:w="http://schemas.openxmlformats.org/wordprocessingml/2006/main" xmlns:w14="http://schemas.microsoft.com/office/word/2010/wordml" xmlns:w15="http://schemas.microsoft.com/office/word/2012/wordml" xmlns:w16cex="http://schemas.microsoft.com/office/word/2018/wordml/cex" xmlns:w16cid="http://schemas.microsoft.com/office/word/2016/wordml/cid" xmlns:w16="http://schemas.microsoft.com/office/word/2018/wordml" xmlns:w16du="http://schemas.microsoft.com/office/word/2023/wordml/word16du" xmlns:w16sdtdh="http://schemas.microsoft.com/office/word/2020/wordml/sdtdatahash" xmlns:w16se="http://schemas.microsoft.com/office/word/2015/wordml/symex" xmlns:wpg="http://schemas.microsoft.com/office/word/2010/wordprocessingGroup" xmlns:wpi="http://schemas.microsoft.com/office/word/2010/wordprocessingInk" xmlns:wne="http://schemas.microsoft.com/office/word/2006/wordml" xmlns:wps="http://schemas.microsoft.com/office/word/2010/wordprocessingShape" mc:Ignorable="w14 w15 w16se w16cid w16 w16cex w16sdtdh w16du wp14">
+  <w:footnote w:type="separator" w:id="-1">
+    <w:p>
+      <w:r>
+        <w:separator/>
+      </w:r>
+    </w:p>
+  </w:footnote>
+  <w:footnote w:type="continuationSeparator" w:id="0">
+    <w:p>
+      <w:r>
+        <w:continuationSeparator/>
+      </w:r>
+    </w:p>
+  </w:footnote>
+</w:footnotes>
+</file>
+
+<file path=word/header1.xml><?xml version="1.0" encoding="utf-8"?>
+<w:hdr xmlns:wpc="http://schemas.microsoft.com/office/word/2010/wordprocessingCanvas" xmlns:cx="http://schemas.microsoft.com/office/drawing/2014/chartex" xmlns:cx1="http://schemas.microsoft.com/office/drawing/2015/9/8/chartex" xmlns:cx2="http://schemas.microsoft.com/office/drawing/2015/10/21/chartex" xmlns:cx3="http://schemas.microsoft.com/office/drawing/2016/5/9/chartex" xmlns:cx4="http://schemas.microsoft.com/office/drawing/2016/5/10/chartex" xmlns:cx5="http://schemas.microsoft.com/office/drawing/2016/5/11/chartex" xmlns:cx6="http://schemas.microsoft.com/office/drawing/2016/5/12/chartex" xmlns:cx7="http://schemas.microsoft.com/office/drawing/2016/5/13/chartex" xmlns:cx8="http://schemas.microsoft.com/office/drawing/2016/5/14/chartex" xmlns:mc="http://schemas.openxmlformats.org/markup-compatibility/2006" xmlns:aink="http://schemas.microsoft.com/office/drawing/2016/ink" xmlns:am3d="http://schemas.microsoft.com/office/drawing/2017/model3d" xmlns:o="urn:schemas-microsoft-com:office:office" xmlns:oel="http://schemas.microsoft.com/office/2019/extlst" xmlns:r="http://schemas.openxmlformats.org/officeDocument/2006/relationships" xmlns:m="http://schemas.openxmlformats.org/officeDocument/2006/math" xmlns:v="urn:schemas-microsoft-com:vml" xmlns:wp14="http://schemas.microsoft.com/office/word/2010/wordprocessingDrawing" xmlns:wp="http://schemas.openxmlformats.org/drawingml/2006/wordprocessingDrawing" xmlns:w10="urn:schemas-microsoft-com:office:word" xmlns:w="http://schemas.openxmlformats.org/wordprocessingml/2006/main" xmlns:w14="http://schemas.microsoft.com/office/word/2010/wordml" xmlns:w15="http://schemas.microsoft.com/office/word/2012/wordml" xmlns:w16cex="http://schemas.microsoft.com/office/word/2018/wordml/cex" xmlns:w16cid="http://schemas.microsoft.com/office/word/2016/wordml/cid" xmlns:w16="http://schemas.microsoft.com/office/word/2018/wordml" xmlns:w16du="http://schemas.microsoft.com/office/word/2023/wordml/word16du" xmlns:w16sdtdh="http://schemas.microsoft.com/office/word/2020/wordml/sdtdatahash" xmlns:w16se="http://schemas.microsoft.com/office/word/2015/wordml/symex" xmlns:wpg="http://schemas.microsoft.com/office/word/2010/wordprocessingGroup" xmlns:wpi="http://schemas.microsoft.com/office/word/2010/wordprocessingInk" xmlns:wne="http://schemas.microsoft.com/office/word/2006/wordml" xmlns:wps="http://schemas.microsoft.com/office/word/2010/wordprocessingShape" mc:Ignorable="w14 w15 w16se w16cid w16 w16cex w16sdtdh w16du wp14">
+  <w:p>
+    <w:pPr>
+      <w:pStyle w:val="Header"/>
+    </w:pPr>
+  </w:p>
+</w:hdr>
+</file>
+
+<file path=word/header2.xml><?xml version="1.0" encoding="utf-8"?>
+<w:hdr xmlns:wpc="http://schemas.microsoft.com/office/word/2010/wordprocessingCanvas" xmlns:cx="http://schemas.microsoft.com/office/drawing/2014/chartex" xmlns:cx1="http://schemas.microsoft.com/office/drawing/2015/9/8/chartex" xmlns:cx2="http://schemas.microsoft.com/office/drawing/2015/10/21/chartex" xmlns:cx3="http://schemas.microsoft.com/office/drawing/2016/5/9/chartex" xmlns:cx4="http://schemas.microsoft.com/office/drawing/2016/5/10/chartex" xmlns:cx5="http://schemas.microsoft.com/office/drawing/2016/5/11/chartex" xmlns:cx6="http://schemas.microsoft.com/office/drawing/2016/5/12/chartex" xmlns:cx7="http://schemas.microsoft.com/office/drawing/2016/5/13/chartex" xmlns:cx8="http://schemas.microsoft.com/office/drawing/2016/5/14/chartex" xmlns:mc="http://schemas.openxmlformats.org/markup-compatibility/2006" xmlns:aink="http://schemas.microsoft.com/office/drawing/2016/ink" xmlns:am3d="http://schemas.microsoft.com/office/drawing/2017/model3d" xmlns:o="urn:schemas-microsoft-com:office:office" xmlns:oel="http://schemas.microsoft.com/office/2019/extlst" xmlns:r="http://schemas.openxmlformats.org/officeDocument/2006/relationships" xmlns:m="http://schemas.openxmlformats.org/officeDocument/2006/math" xmlns:v="urn:schemas-microsoft-com:vml" xmlns:wp14="http://schemas.microsoft.com/office/word/2010/wordprocessingDrawing" xmlns:wp="http://schemas.openxmlformats.org/drawingml/2006/wordprocessingDrawing" xmlns:w10="urn:schemas-microsoft-com:office:word" xmlns:w="http://schemas.openxmlformats.org/wordprocessingml/2006/main" xmlns:w14="http://schemas.microsoft.com/office/word/2010/wordml" xmlns:w15="http://schemas.microsoft.com/office/word/2012/wordml" xmlns:w16cex="http://schemas.microsoft.com/office/word/2018/wordml/cex" xmlns:w16cid="http://schemas.microsoft.com/office/word/2016/wordml/cid" xmlns:w16="http://schemas.microsoft.com/office/word/2018/wordml" xmlns:w16du="http://schemas.microsoft.com/office/word/2023/wordml/word16du" xmlns:w16sdtdh="http://schemas.microsoft.com/office/word/2020/wordml/sdtdatahash" xmlns:w16se="http://schemas.microsoft.com/office/word/2015/wordml/symex" xmlns:wpg="http://schemas.microsoft.com/office/word/2010/wordprocessingGroup" xmlns:wpi="http://schemas.microsoft.com/office/word/2010/wordprocessingInk" xmlns:wne="http://schemas.microsoft.com/office/word/2006/wordml" xmlns:wps="http://schemas.microsoft.com/office/word/2010/wordprocessingShape" mc:Ignorable="w14 w15 w16se w16cid w16 w16cex w16sdtdh w16du wp14">
+  <w:p>
+    <w:pPr>
+      <w:pStyle w:val="Header"/>
+    </w:pPr>
+  </w:p>
+</w:hdr>
+</file>
+
+<file path=word/header3.xml><?xml version="1.0" encoding="utf-8"?>
+<w:hdr xmlns:wpc="http://schemas.microsoft.com/office/word/2010/wordprocessingCanvas" xmlns:cx="http://schemas.microsoft.com/office/drawing/2014/chartex" xmlns:cx1="http://schemas.microsoft.com/office/drawing/2015/9/8/chartex" xmlns:cx2="http://schemas.microsoft.com/office/drawing/2015/10/21/chartex" xmlns:cx3="http://schemas.microsoft.com/office/drawing/2016/5/9/chartex" xmlns:cx4="http://schemas.microsoft.com/office/drawing/2016/5/10/chartex" xmlns:cx5="http://schemas.microsoft.com/office/drawing/2016/5/11/chartex" xmlns:cx6="http://schemas.microsoft.com/office/drawing/2016/5/12/chartex" xmlns:cx7="http://schemas.microsoft.com/office/drawing/2016/5/13/chartex" xmlns:cx8="http://schemas.microsoft.com/office/drawing/2016/5/14/chartex" xmlns:mc="http://schemas.openxmlformats.org/markup-compatibility/2006" xmlns:aink="http://schemas.microsoft.com/office/drawing/2016/ink" xmlns:am3d="http://schemas.microsoft.com/office/drawing/2017/model3d" xmlns:o="urn:schemas-microsoft-com:office:office" xmlns:oel="http://schemas.microsoft.com/office/2019/extlst" xmlns:r="http://schemas.openxmlformats.org/officeDocument/2006/relationships" xmlns:m="http://schemas.openxmlformats.org/officeDocument/2006/math" xmlns:v="urn:schemas-microsoft-com:vml" xmlns:wp14="http://schemas.microsoft.com/office/word/2010/wordprocessingDrawing" xmlns:wp="http://schemas.openxmlformats.org/drawingml/2006/wordprocessingDrawing" xmlns:w10="urn:schemas-microsoft-com:office:word" xmlns:w="http://schemas.openxmlformats.org/wordprocessingml/2006/main" xmlns:w14="http://schemas.microsoft.com/office/word/2010/wordml" xmlns:w15="http://schemas.microsoft.com/office/word/2012/wordml" xmlns:w16cex="http://schemas.microsoft.com/office/word/2018/wordml/cex" xmlns:w16cid="http://schemas.microsoft.com/office/word/2016/wordml/cid" xmlns:w16="http://schemas.microsoft.com/office/word/2018/wordml" xmlns:w16du="http://schemas.microsoft.com/office/word/2023/wordml/word16du" xmlns:w16sdtdh="http://schemas.microsoft.com/office/word/2020/wordml/sdtdatahash" xmlns:w16se="http://schemas.microsoft.com/office/word/2015/wordml/symex" xmlns:wpg="http://schemas.microsoft.com/office/word/2010/wordprocessingGroup" xmlns:wpi="http://schemas.microsoft.com/office/word/2010/wordprocessingInk" xmlns:wne="http://schemas.microsoft.com/office/word/2006/wordml" xmlns:wps="http://schemas.microsoft.com/office/word/2010/wordprocessingShape" mc:Ignorable="w14 w15 w16se w16cid w16 w16cex w16sdtdh w16du wp14">
+  <w:p>
+    <w:pPr>
+      <w:pStyle w:val="Header"/>
+    </w:pPr>
+  </w:p>
+</w:hdr>
 </file>
 
 <file path=word/numbering.xml><?xml version="1.0" encoding="utf-8"?>
@@ -5018,6 +5508,119 @@
     </w:lvl>
   </w:abstractNum>
   <w:abstractNum w:abstractNumId="9" w15:restartNumberingAfterBreak="0">
+    <w:nsid w:val="43776CBE"/>
+    <w:multiLevelType w:val="hybridMultilevel"/>
+    <w:tmpl w:val="FC201D76"/>
+    <w:lvl w:ilvl="0" w:tplc="04090001">
+      <w:start w:val="1"/>
+      <w:numFmt w:val="bullet"/>
+      <w:lvlText w:val=""/>
+      <w:lvlJc w:val="left"/>
+      <w:pPr>
+        <w:ind w:left="720" w:hanging="360"/>
+      </w:pPr>
+      <w:rPr>
+        <w:rFonts w:ascii="Symbol" w:hAnsi="Symbol" w:hint="default"/>
+      </w:rPr>
+    </w:lvl>
+    <w:lvl w:ilvl="1" w:tplc="04090003" w:tentative="1">
+      <w:start w:val="1"/>
+      <w:numFmt w:val="bullet"/>
+      <w:lvlText w:val="o"/>
+      <w:lvlJc w:val="left"/>
+      <w:pPr>
+        <w:ind w:left="1440" w:hanging="360"/>
+      </w:pPr>
+      <w:rPr>
+        <w:rFonts w:ascii="Courier New" w:hAnsi="Courier New" w:cs="Courier New" w:hint="default"/>
+      </w:rPr>
+    </w:lvl>
+    <w:lvl w:ilvl="2" w:tplc="04090005" w:tentative="1">
+      <w:start w:val="1"/>
+      <w:numFmt w:val="bullet"/>
+      <w:lvlText w:val=""/>
+      <w:lvlJc w:val="left"/>
+      <w:pPr>
+        <w:ind w:left="2160" w:hanging="360"/>
+      </w:pPr>
+      <w:rPr>
+        <w:rFonts w:ascii="Wingdings" w:hAnsi="Wingdings" w:hint="default"/>
+      </w:rPr>
+    </w:lvl>
+    <w:lvl w:ilvl="3" w:tplc="04090001" w:tentative="1">
+      <w:start w:val="1"/>
+      <w:numFmt w:val="bullet"/>
+      <w:lvlText w:val=""/>
+      <w:lvlJc w:val="left"/>
+      <w:pPr>
+        <w:ind w:left="2880" w:hanging="360"/>
+      </w:pPr>
+      <w:rPr>
+        <w:rFonts w:ascii="Symbol" w:hAnsi="Symbol" w:hint="default"/>
+      </w:rPr>
+    </w:lvl>
+    <w:lvl w:ilvl="4" w:tplc="04090003" w:tentative="1">
+      <w:start w:val="1"/>
+      <w:numFmt w:val="bullet"/>
+      <w:lvlText w:val="o"/>
+      <w:lvlJc w:val="left"/>
+      <w:pPr>
+        <w:ind w:left="3600" w:hanging="360"/>
+      </w:pPr>
+      <w:rPr>
+        <w:rFonts w:ascii="Courier New" w:hAnsi="Courier New" w:cs="Courier New" w:hint="default"/>
+      </w:rPr>
+    </w:lvl>
+    <w:lvl w:ilvl="5" w:tplc="04090005" w:tentative="1">
+      <w:start w:val="1"/>
+      <w:numFmt w:val="bullet"/>
+      <w:lvlText w:val=""/>
+      <w:lvlJc w:val="left"/>
+      <w:pPr>
+        <w:ind w:left="4320" w:hanging="360"/>
+      </w:pPr>
+      <w:rPr>
+        <w:rFonts w:ascii="Wingdings" w:hAnsi="Wingdings" w:hint="default"/>
+      </w:rPr>
+    </w:lvl>
+    <w:lvl w:ilvl="6" w:tplc="04090001" w:tentative="1">
+      <w:start w:val="1"/>
+      <w:numFmt w:val="bullet"/>
+      <w:lvlText w:val=""/>
+      <w:lvlJc w:val="left"/>
+      <w:pPr>
+        <w:ind w:left="5040" w:hanging="360"/>
+      </w:pPr>
+      <w:rPr>
+        <w:rFonts w:ascii="Symbol" w:hAnsi="Symbol" w:hint="default"/>
+      </w:rPr>
+    </w:lvl>
+    <w:lvl w:ilvl="7" w:tplc="04090003" w:tentative="1">
+      <w:start w:val="1"/>
+      <w:numFmt w:val="bullet"/>
+      <w:lvlText w:val="o"/>
+      <w:lvlJc w:val="left"/>
+      <w:pPr>
+        <w:ind w:left="5760" w:hanging="360"/>
+      </w:pPr>
+      <w:rPr>
+        <w:rFonts w:ascii="Courier New" w:hAnsi="Courier New" w:cs="Courier New" w:hint="default"/>
+      </w:rPr>
+    </w:lvl>
+    <w:lvl w:ilvl="8" w:tplc="04090005" w:tentative="1">
+      <w:start w:val="1"/>
+      <w:numFmt w:val="bullet"/>
+      <w:lvlText w:val=""/>
+      <w:lvlJc w:val="left"/>
+      <w:pPr>
+        <w:ind w:left="6480" w:hanging="360"/>
+      </w:pPr>
+      <w:rPr>
+        <w:rFonts w:ascii="Wingdings" w:hAnsi="Wingdings" w:hint="default"/>
+      </w:rPr>
+    </w:lvl>
+  </w:abstractNum>
+  <w:abstractNum w:abstractNumId="10" w15:restartNumberingAfterBreak="0">
     <w:nsid w:val="4ECC27E8"/>
     <w:multiLevelType w:val="hybridMultilevel"/>
     <w:tmpl w:val="5448D07E"/>
@@ -5130,7 +5733,120 @@
       </w:rPr>
     </w:lvl>
   </w:abstractNum>
-  <w:abstractNum w:abstractNumId="10" w15:restartNumberingAfterBreak="0">
+  <w:abstractNum w:abstractNumId="11" w15:restartNumberingAfterBreak="0">
+    <w:nsid w:val="5CFD2579"/>
+    <w:multiLevelType w:val="hybridMultilevel"/>
+    <w:tmpl w:val="7D629FCC"/>
+    <w:lvl w:ilvl="0" w:tplc="04090001">
+      <w:start w:val="1"/>
+      <w:numFmt w:val="bullet"/>
+      <w:lvlText w:val=""/>
+      <w:lvlJc w:val="left"/>
+      <w:pPr>
+        <w:ind w:left="839" w:hanging="360"/>
+      </w:pPr>
+      <w:rPr>
+        <w:rFonts w:ascii="Symbol" w:hAnsi="Symbol" w:hint="default"/>
+      </w:rPr>
+    </w:lvl>
+    <w:lvl w:ilvl="1" w:tplc="04090003" w:tentative="1">
+      <w:start w:val="1"/>
+      <w:numFmt w:val="bullet"/>
+      <w:lvlText w:val="o"/>
+      <w:lvlJc w:val="left"/>
+      <w:pPr>
+        <w:ind w:left="1559" w:hanging="360"/>
+      </w:pPr>
+      <w:rPr>
+        <w:rFonts w:ascii="Courier New" w:hAnsi="Courier New" w:cs="Courier New" w:hint="default"/>
+      </w:rPr>
+    </w:lvl>
+    <w:lvl w:ilvl="2" w:tplc="04090005" w:tentative="1">
+      <w:start w:val="1"/>
+      <w:numFmt w:val="bullet"/>
+      <w:lvlText w:val=""/>
+      <w:lvlJc w:val="left"/>
+      <w:pPr>
+        <w:ind w:left="2279" w:hanging="360"/>
+      </w:pPr>
+      <w:rPr>
+        <w:rFonts w:ascii="Wingdings" w:hAnsi="Wingdings" w:hint="default"/>
+      </w:rPr>
+    </w:lvl>
+    <w:lvl w:ilvl="3" w:tplc="04090001" w:tentative="1">
+      <w:start w:val="1"/>
+      <w:numFmt w:val="bullet"/>
+      <w:lvlText w:val=""/>
+      <w:lvlJc w:val="left"/>
+      <w:pPr>
+        <w:ind w:left="2999" w:hanging="360"/>
+      </w:pPr>
+      <w:rPr>
+        <w:rFonts w:ascii="Symbol" w:hAnsi="Symbol" w:hint="default"/>
+      </w:rPr>
+    </w:lvl>
+    <w:lvl w:ilvl="4" w:tplc="04090003" w:tentative="1">
+      <w:start w:val="1"/>
+      <w:numFmt w:val="bullet"/>
+      <w:lvlText w:val="o"/>
+      <w:lvlJc w:val="left"/>
+      <w:pPr>
+        <w:ind w:left="3719" w:hanging="360"/>
+      </w:pPr>
+      <w:rPr>
+        <w:rFonts w:ascii="Courier New" w:hAnsi="Courier New" w:cs="Courier New" w:hint="default"/>
+      </w:rPr>
+    </w:lvl>
+    <w:lvl w:ilvl="5" w:tplc="04090005" w:tentative="1">
+      <w:start w:val="1"/>
+      <w:numFmt w:val="bullet"/>
+      <w:lvlText w:val=""/>
+      <w:lvlJc w:val="left"/>
+      <w:pPr>
+        <w:ind w:left="4439" w:hanging="360"/>
+      </w:pPr>
+      <w:rPr>
+        <w:rFonts w:ascii="Wingdings" w:hAnsi="Wingdings" w:hint="default"/>
+      </w:rPr>
+    </w:lvl>
+    <w:lvl w:ilvl="6" w:tplc="04090001" w:tentative="1">
+      <w:start w:val="1"/>
+      <w:numFmt w:val="bullet"/>
+      <w:lvlText w:val=""/>
+      <w:lvlJc w:val="left"/>
+      <w:pPr>
+        <w:ind w:left="5159" w:hanging="360"/>
+      </w:pPr>
+      <w:rPr>
+        <w:rFonts w:ascii="Symbol" w:hAnsi="Symbol" w:hint="default"/>
+      </w:rPr>
+    </w:lvl>
+    <w:lvl w:ilvl="7" w:tplc="04090003" w:tentative="1">
+      <w:start w:val="1"/>
+      <w:numFmt w:val="bullet"/>
+      <w:lvlText w:val="o"/>
+      <w:lvlJc w:val="left"/>
+      <w:pPr>
+        <w:ind w:left="5879" w:hanging="360"/>
+      </w:pPr>
+      <w:rPr>
+        <w:rFonts w:ascii="Courier New" w:hAnsi="Courier New" w:cs="Courier New" w:hint="default"/>
+      </w:rPr>
+    </w:lvl>
+    <w:lvl w:ilvl="8" w:tplc="04090005" w:tentative="1">
+      <w:start w:val="1"/>
+      <w:numFmt w:val="bullet"/>
+      <w:lvlText w:val=""/>
+      <w:lvlJc w:val="left"/>
+      <w:pPr>
+        <w:ind w:left="6599" w:hanging="360"/>
+      </w:pPr>
+      <w:rPr>
+        <w:rFonts w:ascii="Wingdings" w:hAnsi="Wingdings" w:hint="default"/>
+      </w:rPr>
+    </w:lvl>
+  </w:abstractNum>
+  <w:abstractNum w:abstractNumId="12" w15:restartNumberingAfterBreak="0">
     <w:nsid w:val="6A79685A"/>
     <w:multiLevelType w:val="hybridMultilevel"/>
     <w:tmpl w:val="CBCCD608"/>
@@ -5243,7 +5959,7 @@
       </w:rPr>
     </w:lvl>
   </w:abstractNum>
-  <w:abstractNum w:abstractNumId="11" w15:restartNumberingAfterBreak="0">
+  <w:abstractNum w:abstractNumId="13" w15:restartNumberingAfterBreak="0">
     <w:nsid w:val="76EA3C9D"/>
     <w:multiLevelType w:val="hybridMultilevel"/>
     <w:tmpl w:val="41BC5F10"/>
@@ -5374,13 +6090,13 @@
     <w:abstractNumId w:val="1"/>
   </w:num>
   <w:num w:numId="2" w16cid:durableId="1908761102">
-    <w:abstractNumId w:val="11"/>
+    <w:abstractNumId w:val="13"/>
   </w:num>
   <w:num w:numId="3" w16cid:durableId="260771181">
     <w:abstractNumId w:val="4"/>
   </w:num>
   <w:num w:numId="4" w16cid:durableId="145633952">
-    <w:abstractNumId w:val="9"/>
+    <w:abstractNumId w:val="10"/>
   </w:num>
   <w:num w:numId="5" w16cid:durableId="1522475440">
     <w:abstractNumId w:val="3"/>
@@ -5389,7 +6105,7 @@
     <w:abstractNumId w:val="8"/>
   </w:num>
   <w:num w:numId="7" w16cid:durableId="996492515">
-    <w:abstractNumId w:val="10"/>
+    <w:abstractNumId w:val="12"/>
   </w:num>
   <w:num w:numId="8" w16cid:durableId="1978335259">
     <w:abstractNumId w:val="6"/>
@@ -5405,6 +6121,12 @@
   </w:num>
   <w:num w:numId="12" w16cid:durableId="1127940330">
     <w:abstractNumId w:val="5"/>
+  </w:num>
+  <w:num w:numId="13" w16cid:durableId="236406010">
+    <w:abstractNumId w:val="11"/>
+  </w:num>
+  <w:num w:numId="14" w16cid:durableId="2038651280">
+    <w:abstractNumId w:val="9"/>
   </w:num>
 </w:numbering>
 </file>
@@ -5876,6 +6598,7 @@
   <w:style w:type="character" w:default="1" w:styleId="DefaultParagraphFont">
     <w:name w:val="Default Paragraph Font"/>
     <w:uiPriority w:val="1"/>
+    <w:semiHidden/>
     <w:unhideWhenUsed/>
   </w:style>
   <w:style w:type="table" w:default="1" w:styleId="TableNormal">
@@ -6075,6 +6798,54 @@
       <w:color w:val="243F60" w:themeColor="accent1" w:themeShade="7F"/>
       <w:sz w:val="24"/>
       <w:szCs w:val="24"/>
+    </w:rPr>
+  </w:style>
+  <w:style w:type="paragraph" w:styleId="Header">
+    <w:name w:val="header"/>
+    <w:basedOn w:val="Normal"/>
+    <w:link w:val="HeaderChar"/>
+    <w:uiPriority w:val="99"/>
+    <w:unhideWhenUsed/>
+    <w:rsid w:val="00965125"/>
+    <w:pPr>
+      <w:tabs>
+        <w:tab w:val="center" w:pos="4680"/>
+        <w:tab w:val="right" w:pos="9360"/>
+      </w:tabs>
+    </w:pPr>
+  </w:style>
+  <w:style w:type="character" w:customStyle="1" w:styleId="HeaderChar">
+    <w:name w:val="Header Char"/>
+    <w:basedOn w:val="DefaultParagraphFont"/>
+    <w:link w:val="Header"/>
+    <w:uiPriority w:val="99"/>
+    <w:rsid w:val="00965125"/>
+    <w:rPr>
+      <w:rFonts w:ascii="Times New Roman" w:eastAsia="Times New Roman" w:hAnsi="Times New Roman" w:cs="Times New Roman"/>
+    </w:rPr>
+  </w:style>
+  <w:style w:type="paragraph" w:styleId="Footer">
+    <w:name w:val="footer"/>
+    <w:basedOn w:val="Normal"/>
+    <w:link w:val="FooterChar"/>
+    <w:uiPriority w:val="99"/>
+    <w:unhideWhenUsed/>
+    <w:rsid w:val="00965125"/>
+    <w:pPr>
+      <w:tabs>
+        <w:tab w:val="center" w:pos="4680"/>
+        <w:tab w:val="right" w:pos="9360"/>
+      </w:tabs>
+    </w:pPr>
+  </w:style>
+  <w:style w:type="character" w:customStyle="1" w:styleId="FooterChar">
+    <w:name w:val="Footer Char"/>
+    <w:basedOn w:val="DefaultParagraphFont"/>
+    <w:link w:val="Footer"/>
+    <w:uiPriority w:val="99"/>
+    <w:rsid w:val="00965125"/>
+    <w:rPr>
+      <w:rFonts w:ascii="Times New Roman" w:eastAsia="Times New Roman" w:hAnsi="Times New Roman" w:cs="Times New Roman"/>
     </w:rPr>
   </w:style>
 </w:styles>
@@ -6361,4 +7132,32 @@
   <a:objectDefaults/>
   <a:extraClrSchemeLst/>
 </a:theme>
+</file>
+
+<file path=word/webextensions/taskpanes.xml><?xml version="1.0" encoding="utf-8"?>
+<wetp:taskpanes xmlns:wetp="http://schemas.microsoft.com/office/webextensions/taskpanes/2010/11">
+  <wetp:taskpane dockstate="right" visibility="0" width="350" row="0">
+    <wetp:webextensionref xmlns:r="http://schemas.openxmlformats.org/officeDocument/2006/relationships" r:id="rId1"/>
+  </wetp:taskpane>
+</wetp:taskpanes>
+</file>
+
+<file path=word/webextensions/webextension1.xml><?xml version="1.0" encoding="utf-8"?>
+<we:webextension xmlns:we="http://schemas.microsoft.com/office/webextensions/webextension/2010/11" id="{87F94277-58FF-444F-AD0F-7D8912B9C9A6}">
+  <we:reference id="wa200010725" version="1.0.0.1" store="en-US" storeType="OMEX"/>
+  <we:alternateReferences>
+    <we:reference id="WA200010725" version="1.0.0.1" store="" storeType="OMEX"/>
+  </we:alternateReferences>
+  <we:properties>
+    <we:property name="claude.fileId" value="&quot;66755b7c-2bd8-43c1-973a-06b3dcfe97d6&quot;"/>
+  </we:properties>
+  <we:bindings/>
+  <we:snapshot xmlns:r="http://schemas.openxmlformats.org/officeDocument/2006/relationships"/>
+</we:webextension>
+</file>
+
+<file path=docMetadata/LabelInfo.xml><?xml version="1.0" encoding="utf-8"?>
+<clbl:labelList xmlns:clbl="http://schemas.microsoft.com/office/2020/mipLabelMetadata">
+  <clbl:label id="{170051ed-867f-4092-a6af-8a42e27b7e09}" enabled="1" method="Standard" siteId="{5217e0e7-539d-4563-b1bf-7c6dcf074f91}" contentBits="0" removed="0"/>
+</clbl:labelList>
 </file>
</xml_diff>